<commit_message>
feat: document and validate selected corpus
</commit_message>
<xml_diff>
--- a/Evidencia/FJ1656_MañanáSantana_U02.LAB04.docx
+++ b/Evidencia/FJ1656_MañanáSantana_U02.LAB04.docx
@@ -4994,6 +4994,104 @@
           <w:rFonts w:ascii="Times New Roman" w:hAnsi="Times New Roman" w:cs="Times New Roman"/>
         </w:rPr>
       </w:pPr>
+      <w:r>
+        <w:rPr>
+          <w:rFonts w:ascii="Times New Roman" w:hAnsi="Times New Roman" w:cs="Times New Roman"/>
+        </w:rPr>
+        <w:lastRenderedPageBreak/>
+        <w:drawing>
+          <wp:inline distT="0" distB="0" distL="0" distR="0" wp14:anchorId="12571213" wp14:editId="684220BF">
+            <wp:extent cx="5943600" cy="5965825"/>
+            <wp:effectExtent l="0" t="0" r="0" b="0"/>
+            <wp:docPr id="161150795" name="Imagen 1"/>
+            <wp:cNvGraphicFramePr>
+              <a:graphicFrameLocks xmlns:a="http://schemas.openxmlformats.org/drawingml/2006/main" noChangeAspect="1"/>
+            </wp:cNvGraphicFramePr>
+            <a:graphic xmlns:a="http://schemas.openxmlformats.org/drawingml/2006/main">
+              <a:graphicData uri="http://schemas.openxmlformats.org/drawingml/2006/picture">
+                <pic:pic xmlns:pic="http://schemas.openxmlformats.org/drawingml/2006/picture">
+                  <pic:nvPicPr>
+                    <pic:cNvPr id="161150795" name=""/>
+                    <pic:cNvPicPr/>
+                  </pic:nvPicPr>
+                  <pic:blipFill>
+                    <a:blip r:embed="rId23"/>
+                    <a:stretch>
+                      <a:fillRect/>
+                    </a:stretch>
+                  </pic:blipFill>
+                  <pic:spPr>
+                    <a:xfrm>
+                      <a:off x="0" y="0"/>
+                      <a:ext cx="5943600" cy="5965825"/>
+                    </a:xfrm>
+                    <a:prstGeom prst="rect">
+                      <a:avLst/>
+                    </a:prstGeom>
+                  </pic:spPr>
+                </pic:pic>
+              </a:graphicData>
+            </a:graphic>
+          </wp:inline>
+        </w:drawing>
+      </w:r>
+    </w:p>
+    <w:p>
+      <w:pPr>
+        <w:jc w:val="both"/>
+        <w:rPr>
+          <w:rFonts w:ascii="Times New Roman" w:hAnsi="Times New Roman" w:cs="Times New Roman"/>
+        </w:rPr>
+      </w:pPr>
+      <w:r>
+        <w:rPr>
+          <w:rFonts w:ascii="Times New Roman" w:hAnsi="Times New Roman" w:cs="Times New Roman"/>
+        </w:rPr>
+        <w:lastRenderedPageBreak/>
+        <w:drawing>
+          <wp:inline distT="0" distB="0" distL="0" distR="0" wp14:anchorId="710E5188" wp14:editId="23713FD0">
+            <wp:extent cx="5943600" cy="6142990"/>
+            <wp:effectExtent l="0" t="0" r="0" b="0"/>
+            <wp:docPr id="110612441" name="Imagen 1"/>
+            <wp:cNvGraphicFramePr>
+              <a:graphicFrameLocks xmlns:a="http://schemas.openxmlformats.org/drawingml/2006/main" noChangeAspect="1"/>
+            </wp:cNvGraphicFramePr>
+            <a:graphic xmlns:a="http://schemas.openxmlformats.org/drawingml/2006/main">
+              <a:graphicData uri="http://schemas.openxmlformats.org/drawingml/2006/picture">
+                <pic:pic xmlns:pic="http://schemas.openxmlformats.org/drawingml/2006/picture">
+                  <pic:nvPicPr>
+                    <pic:cNvPr id="110612441" name=""/>
+                    <pic:cNvPicPr/>
+                  </pic:nvPicPr>
+                  <pic:blipFill>
+                    <a:blip r:embed="rId24"/>
+                    <a:stretch>
+                      <a:fillRect/>
+                    </a:stretch>
+                  </pic:blipFill>
+                  <pic:spPr>
+                    <a:xfrm>
+                      <a:off x="0" y="0"/>
+                      <a:ext cx="5943600" cy="6142990"/>
+                    </a:xfrm>
+                    <a:prstGeom prst="rect">
+                      <a:avLst/>
+                    </a:prstGeom>
+                  </pic:spPr>
+                </pic:pic>
+              </a:graphicData>
+            </a:graphic>
+          </wp:inline>
+        </w:drawing>
+      </w:r>
+    </w:p>
+    <w:p>
+      <w:pPr>
+        <w:jc w:val="both"/>
+        <w:rPr>
+          <w:rFonts w:ascii="Times New Roman" w:hAnsi="Times New Roman" w:cs="Times New Roman"/>
+        </w:rPr>
+      </w:pPr>
     </w:p>
     <w:p>
       <w:pPr>
@@ -5268,7 +5366,6 @@
           <w:b/>
           <w:bCs/>
         </w:rPr>
-        <w:lastRenderedPageBreak/>
         <w:t>Solución y Decisión de Arquitectura:</w:t>
       </w:r>
       <w:r>
@@ -5885,6 +5982,7 @@
           <w:b/>
           <w:bCs/>
         </w:rPr>
+        <w:lastRenderedPageBreak/>
         <w:t>Solución:</w:t>
       </w:r>
     </w:p>
@@ -6193,7 +6291,6 @@
           <w:b/>
           <w:bCs/>
         </w:rPr>
-        <w:lastRenderedPageBreak/>
         <w:t>Problema:</w:t>
       </w:r>
       <w:r>
@@ -6705,7 +6802,7 @@
       </w:r>
     </w:p>
     <w:sectPr>
-      <w:headerReference w:type="first" r:id="rId23"/>
+      <w:headerReference w:type="first" r:id="rId25"/>
       <w:pgSz w:w="12240" w:h="15840" w:code="1"/>
       <w:pgMar w:top="1440" w:right="1440" w:bottom="1440" w:left="1440" w:header="709" w:footer="709" w:gutter="0"/>
       <w:pgNumType w:start="0"/>
@@ -10226,6 +10323,7 @@
     <w:rsid w:val="001E14F3"/>
     <w:rsid w:val="00204CD8"/>
     <w:rsid w:val="002071F7"/>
+    <w:rsid w:val="00213C19"/>
     <w:rsid w:val="00242EDE"/>
     <w:rsid w:val="002B058C"/>
     <w:rsid w:val="002B452E"/>
@@ -10249,7 +10347,6 @@
     <w:rsid w:val="00653EC9"/>
     <w:rsid w:val="00680FFF"/>
     <w:rsid w:val="006B3248"/>
-    <w:rsid w:val="006C11E9"/>
     <w:rsid w:val="006D04E6"/>
     <w:rsid w:val="0072129D"/>
     <w:rsid w:val="007A2CC3"/>

</xml_diff>

<commit_message>
docs: update README with full project structure, dataset selection matrix and audit steps
</commit_message>
<xml_diff>
--- a/Evidencia/FJ1656_MañanáSantana_U02.LAB04.docx
+++ b/Evidencia/FJ1656_MañanáSantana_U02.LAB04.docx
@@ -125,6 +125,7 @@
             <w:dataBinding w:prefixMappings="xmlns:ns0='http://purl.org/dc/elements/1.1/' xmlns:ns1='http://schemas.openxmlformats.org/package/2006/metadata/core-properties' " w:xpath="/ns1:coreProperties[1]/ns0:title[1]" w:storeItemID="{6C3C8BC8-F283-45AE-878A-BAB7291924A1}"/>
             <w:text/>
           </w:sdtPr>
+          <w:sdtEndPr/>
           <w:sdtContent>
             <w:p>
               <w:pPr>
@@ -206,6 +207,7 @@
             <w:dataBinding w:prefixMappings="xmlns:ns0='http://purl.org/dc/elements/1.1/' xmlns:ns1='http://schemas.openxmlformats.org/package/2006/metadata/core-properties' " w:xpath="/ns1:coreProperties[1]/ns0:subject[1]" w:storeItemID="{6C3C8BC8-F283-45AE-878A-BAB7291924A1}"/>
             <w:text/>
           </w:sdtPr>
+          <w:sdtEndPr/>
           <w:sdtContent>
             <w:p>
               <w:pPr>
@@ -343,6 +345,7 @@
                                     <w:calendar w:val="gregorian"/>
                                   </w:date>
                                 </w:sdtPr>
+                                <w:sdtEndPr/>
                                 <w:sdtContent>
                                   <w:p>
                                     <w:pPr>
@@ -391,6 +394,7 @@
                                     <w:dataBinding w:prefixMappings="xmlns:ns0='http://schemas.openxmlformats.org/officeDocument/2006/extended-properties' " w:xpath="/ns0:Properties[1]/ns0:Company[1]" w:storeItemID="{6668398D-A668-4E3E-A5EB-62B293D839F1}"/>
                                     <w:text/>
                                   </w:sdtPr>
+                                  <w:sdtEndPr/>
                                   <w:sdtContent>
                                     <w:r>
                                       <w:rPr>
@@ -493,6 +497,7 @@
                               <w:calendar w:val="gregorian"/>
                             </w:date>
                           </w:sdtPr>
+                          <w:sdtEndPr/>
                           <w:sdtContent>
                             <w:p>
                               <w:pPr>
@@ -541,6 +546,7 @@
                               <w:dataBinding w:prefixMappings="xmlns:ns0='http://schemas.openxmlformats.org/officeDocument/2006/extended-properties' " w:xpath="/ns0:Properties[1]/ns0:Company[1]" w:storeItemID="{6668398D-A668-4E3E-A5EB-62B293D839F1}"/>
                               <w:text/>
                             </w:sdtPr>
+                            <w:sdtEndPr/>
                             <w:sdtContent>
                               <w:r>
                                 <w:rPr>
@@ -699,14 +705,9 @@
     </w:sdt>
     <w:p>
       <w:pPr>
-        <w:jc w:val="both"/>
-        <w:rPr>
-          <w:rFonts w:ascii="Times New Roman" w:hAnsi="Times New Roman" w:cs="Times New Roman"/>
-        </w:rPr>
-      </w:pPr>
-    </w:p>
-    <w:p>
-      <w:pPr>
+        <w:tabs>
+          <w:tab w:val="left" w:pos="5364"/>
+        </w:tabs>
         <w:jc w:val="both"/>
         <w:rPr>
           <w:rFonts w:ascii="Times New Roman" w:hAnsi="Times New Roman" w:cs="Times New Roman"/>
@@ -720,25 +721,46 @@
           <w:b/>
           <w:bCs/>
         </w:rPr>
-        <w:t>INF-8239 · Unidad 02 · Proyecto NLP</w:t>
+        <w:lastRenderedPageBreak/>
+        <w:t xml:space="preserve">INFORME DE ENTREGA DE PROYECTO: </w:t>
+      </w:r>
+      <w:r>
+        <w:rPr>
+          <w:rFonts w:ascii="Times New Roman" w:hAnsi="Times New Roman" w:cs="Times New Roman"/>
+          <w:b/>
+          <w:bCs/>
+        </w:rPr>
+        <w:t>U2.LAB004 Auditoria y Uso de un Corpus Publico</w:t>
       </w:r>
     </w:p>
     <w:p>
       <w:pPr>
+        <w:tabs>
+          <w:tab w:val="left" w:pos="5364"/>
+        </w:tabs>
         <w:jc w:val="both"/>
         <w:rPr>
           <w:rFonts w:ascii="Times New Roman" w:hAnsi="Times New Roman" w:cs="Times New Roman"/>
+          <w:b/>
+          <w:bCs/>
         </w:rPr>
       </w:pPr>
       <w:r>
         <w:rPr>
           <w:rFonts w:ascii="Times New Roman" w:hAnsi="Times New Roman" w:cs="Times New Roman"/>
-        </w:rPr>
-        <w:t>Autor académico: Edwin Ramón José Nolasco Replicado y realizado por: Manuel Mañana Santana</w:t>
+          <w:b/>
+          <w:bCs/>
+        </w:rPr>
+        <w:t>1. Enlace al Repositorio del Proyecto</w:t>
       </w:r>
     </w:p>
     <w:p>
       <w:pPr>
+        <w:pStyle w:val="Prrafodelista"/>
+        <w:numPr>
+          <w:ilvl w:val="0"/>
+          <w:numId w:val="5"/>
+        </w:numPr>
         <w:jc w:val="both"/>
         <w:rPr>
           <w:rFonts w:ascii="Times New Roman" w:hAnsi="Times New Roman" w:cs="Times New Roman"/>
@@ -747,12 +769,63 @@
       <w:r>
         <w:rPr>
           <w:rFonts w:ascii="Times New Roman" w:hAnsi="Times New Roman" w:cs="Times New Roman"/>
-        </w:rPr>
-        <w:t>Proyecto base para LAB04–LAB06. No sustituya la comprensión por ejecución mecánica.</w:t>
+          <w:b/>
+          <w:bCs/>
+        </w:rPr>
+        <w:t>URL del Repositorio:</w:t>
+      </w:r>
+      <w:r>
+        <w:rPr>
+          <w:rFonts w:ascii="Times New Roman" w:hAnsi="Times New Roman" w:cs="Times New Roman"/>
+          <w:b/>
+          <w:bCs/>
+        </w:rPr>
+        <w:t xml:space="preserve"> </w:t>
+      </w:r>
+      <w:hyperlink r:id="rId14" w:history="1">
+        <w:r>
+          <w:rPr>
+            <w:rStyle w:val="Hipervnculo"/>
+            <w:rFonts w:ascii="Times New Roman" w:hAnsi="Times New Roman" w:cs="Times New Roman"/>
+          </w:rPr>
+          <w:t>https://github.com/Rickymjms/INF8239_U02_NLP_Proyecto_Base_uv.git</w:t>
+        </w:r>
+      </w:hyperlink>
+    </w:p>
+    <w:p>
+      <w:pPr>
+        <w:numPr>
+          <w:ilvl w:val="0"/>
+          <w:numId w:val="5"/>
+        </w:numPr>
+        <w:tabs>
+          <w:tab w:val="left" w:pos="5364"/>
+        </w:tabs>
+        <w:jc w:val="both"/>
+        <w:rPr>
+          <w:rFonts w:ascii="Times New Roman" w:hAnsi="Times New Roman" w:cs="Times New Roman"/>
+          <w:b/>
+          <w:bCs/>
+        </w:rPr>
+      </w:pPr>
+      <w:r>
+        <w:rPr>
+          <w:rFonts w:ascii="Times New Roman" w:hAnsi="Times New Roman" w:cs="Times New Roman"/>
+          <w:b/>
+          <w:bCs/>
+        </w:rPr>
+        <w:t>Rama Principal: main</w:t>
       </w:r>
     </w:p>
     <w:p>
       <w:pPr>
+        <w:numPr>
+          <w:ilvl w:val="0"/>
+          <w:numId w:val="5"/>
+        </w:numPr>
+        <w:tabs>
+          <w:tab w:val="left" w:pos="5364"/>
+        </w:tabs>
         <w:jc w:val="both"/>
         <w:rPr>
           <w:rFonts w:ascii="Times New Roman" w:hAnsi="Times New Roman" w:cs="Times New Roman"/>
@@ -766,7 +839,7 @@
           <w:b/>
           <w:bCs/>
         </w:rPr>
-        <w:t>Inicio rápido</w:t>
+        <w:t xml:space="preserve">Visibilidad: Público </w:t>
       </w:r>
     </w:p>
     <w:p>
@@ -774,193 +847,17 @@
         <w:jc w:val="both"/>
         <w:rPr>
           <w:rFonts w:ascii="Times New Roman" w:hAnsi="Times New Roman" w:cs="Times New Roman"/>
-        </w:rPr>
-      </w:pPr>
-      <w:proofErr w:type="spellStart"/>
+          <w:b/>
+          <w:bCs/>
+        </w:rPr>
+      </w:pPr>
       <w:r>
         <w:rPr>
           <w:rFonts w:ascii="Times New Roman" w:hAnsi="Times New Roman" w:cs="Times New Roman"/>
-        </w:rPr>
-        <w:t>uv</w:t>
-      </w:r>
-      <w:proofErr w:type="spellEnd"/>
-      <w:r>
-        <w:rPr>
-          <w:rFonts w:ascii="Times New Roman" w:hAnsi="Times New Roman" w:cs="Times New Roman"/>
-        </w:rPr>
-        <w:t xml:space="preserve"> </w:t>
-      </w:r>
-      <w:proofErr w:type="spellStart"/>
-      <w:r>
-        <w:rPr>
-          <w:rFonts w:ascii="Times New Roman" w:hAnsi="Times New Roman" w:cs="Times New Roman"/>
-        </w:rPr>
-        <w:t>python</w:t>
-      </w:r>
-      <w:proofErr w:type="spellEnd"/>
-      <w:r>
-        <w:rPr>
-          <w:rFonts w:ascii="Times New Roman" w:hAnsi="Times New Roman" w:cs="Times New Roman"/>
-        </w:rPr>
-        <w:t xml:space="preserve"> </w:t>
-      </w:r>
-      <w:proofErr w:type="spellStart"/>
-      <w:r>
-        <w:rPr>
-          <w:rFonts w:ascii="Times New Roman" w:hAnsi="Times New Roman" w:cs="Times New Roman"/>
-        </w:rPr>
-        <w:t>install</w:t>
-      </w:r>
-      <w:proofErr w:type="spellEnd"/>
-      <w:r>
-        <w:rPr>
-          <w:rFonts w:ascii="Times New Roman" w:hAnsi="Times New Roman" w:cs="Times New Roman"/>
-        </w:rPr>
-        <w:t xml:space="preserve"> 3.12</w:t>
-      </w:r>
-    </w:p>
-    <w:p>
-      <w:pPr>
-        <w:jc w:val="both"/>
-        <w:rPr>
-          <w:rFonts w:ascii="Times New Roman" w:hAnsi="Times New Roman" w:cs="Times New Roman"/>
-          <w:lang w:val="en-US"/>
-        </w:rPr>
-      </w:pPr>
-      <w:proofErr w:type="spellStart"/>
-      <w:r>
-        <w:rPr>
-          <w:rFonts w:ascii="Times New Roman" w:hAnsi="Times New Roman" w:cs="Times New Roman"/>
-          <w:lang w:val="en-US"/>
-        </w:rPr>
-        <w:t>uv</w:t>
-      </w:r>
-      <w:proofErr w:type="spellEnd"/>
-      <w:r>
-        <w:rPr>
-          <w:rFonts w:ascii="Times New Roman" w:hAnsi="Times New Roman" w:cs="Times New Roman"/>
-          <w:lang w:val="en-US"/>
-        </w:rPr>
-        <w:t xml:space="preserve"> sync</w:t>
-      </w:r>
-    </w:p>
-    <w:p>
-      <w:pPr>
-        <w:jc w:val="both"/>
-        <w:rPr>
-          <w:rFonts w:ascii="Times New Roman" w:hAnsi="Times New Roman" w:cs="Times New Roman"/>
-          <w:lang w:val="en-US"/>
-        </w:rPr>
-      </w:pPr>
-      <w:proofErr w:type="spellStart"/>
-      <w:r>
-        <w:rPr>
-          <w:rFonts w:ascii="Times New Roman" w:hAnsi="Times New Roman" w:cs="Times New Roman"/>
-          <w:lang w:val="en-US"/>
-        </w:rPr>
-        <w:t>uv</w:t>
-      </w:r>
-      <w:proofErr w:type="spellEnd"/>
-      <w:r>
-        <w:rPr>
-          <w:rFonts w:ascii="Times New Roman" w:hAnsi="Times New Roman" w:cs="Times New Roman"/>
-          <w:lang w:val="en-US"/>
-        </w:rPr>
-        <w:t xml:space="preserve"> run </w:t>
-      </w:r>
-      <w:proofErr w:type="spellStart"/>
-      <w:proofErr w:type="gramStart"/>
-      <w:r>
-        <w:rPr>
-          <w:rFonts w:ascii="Times New Roman" w:hAnsi="Times New Roman" w:cs="Times New Roman"/>
-          <w:lang w:val="en-US"/>
-        </w:rPr>
-        <w:t>pytest</w:t>
-      </w:r>
-      <w:proofErr w:type="spellEnd"/>
-      <w:r>
-        <w:rPr>
-          <w:rFonts w:ascii="Times New Roman" w:hAnsi="Times New Roman" w:cs="Times New Roman"/>
-          <w:lang w:val="en-US"/>
-        </w:rPr>
-        <w:t xml:space="preserve"> -q</w:t>
-      </w:r>
-      <w:proofErr w:type="gramEnd"/>
-    </w:p>
-    <w:p>
-      <w:pPr>
-        <w:jc w:val="both"/>
-        <w:rPr>
-          <w:rFonts w:ascii="Times New Roman" w:hAnsi="Times New Roman" w:cs="Times New Roman"/>
-          <w:lang w:val="en-US"/>
-        </w:rPr>
-      </w:pPr>
-      <w:proofErr w:type="spellStart"/>
-      <w:r>
-        <w:rPr>
-          <w:rFonts w:ascii="Times New Roman" w:hAnsi="Times New Roman" w:cs="Times New Roman"/>
-          <w:lang w:val="en-US"/>
-        </w:rPr>
-        <w:t>uv</w:t>
-      </w:r>
-      <w:proofErr w:type="spellEnd"/>
-      <w:r>
-        <w:rPr>
-          <w:rFonts w:ascii="Times New Roman" w:hAnsi="Times New Roman" w:cs="Times New Roman"/>
-          <w:lang w:val="en-US"/>
-        </w:rPr>
-        <w:t xml:space="preserve"> run python scripts/audit_data.py</w:t>
-      </w:r>
-    </w:p>
-    <w:p>
-      <w:pPr>
-        <w:jc w:val="both"/>
-        <w:rPr>
-          <w:rFonts w:ascii="Times New Roman" w:hAnsi="Times New Roman" w:cs="Times New Roman"/>
-          <w:lang w:val="en-US"/>
-        </w:rPr>
-      </w:pPr>
-    </w:p>
-    <w:p>
-      <w:pPr>
-        <w:jc w:val="both"/>
-        <w:rPr>
-          <w:rFonts w:ascii="Times New Roman" w:hAnsi="Times New Roman" w:cs="Times New Roman"/>
-        </w:rPr>
-      </w:pPr>
-      <w:r>
-        <w:rPr>
-          <w:rFonts w:ascii="Times New Roman" w:hAnsi="Times New Roman" w:cs="Times New Roman"/>
-        </w:rPr>
-        <w:t>Copie .</w:t>
-      </w:r>
-      <w:proofErr w:type="spellStart"/>
-      <w:r>
-        <w:rPr>
-          <w:rFonts w:ascii="Times New Roman" w:hAnsi="Times New Roman" w:cs="Times New Roman"/>
-        </w:rPr>
-        <w:t>env.example</w:t>
-      </w:r>
-      <w:proofErr w:type="spellEnd"/>
-      <w:r>
-        <w:rPr>
-          <w:rFonts w:ascii="Times New Roman" w:hAnsi="Times New Roman" w:cs="Times New Roman"/>
-        </w:rPr>
-        <w:t xml:space="preserve"> como .</w:t>
-      </w:r>
-      <w:proofErr w:type="spellStart"/>
-      <w:r>
-        <w:rPr>
-          <w:rFonts w:ascii="Times New Roman" w:hAnsi="Times New Roman" w:cs="Times New Roman"/>
-        </w:rPr>
-        <w:t>env</w:t>
-      </w:r>
-      <w:proofErr w:type="spellEnd"/>
-      <w:r>
-        <w:rPr>
-          <w:rFonts w:ascii="Times New Roman" w:hAnsi="Times New Roman" w:cs="Times New Roman"/>
-        </w:rPr>
-        <w:t xml:space="preserve"> y configure el dataset aprobado.</w:t>
+          <w:b/>
+          <w:bCs/>
+        </w:rPr>
+        <w:t>INF-8239 · Unidad 02 · Proyecto NLP</w:t>
       </w:r>
     </w:p>
     <w:p>
@@ -1018,27 +915,7 @@
           <w:bCs/>
           <w:lang w:val="en-US"/>
         </w:rPr>
-        <w:t>Candidato 1 (</w:t>
-      </w:r>
-      <w:proofErr w:type="spellStart"/>
-      <w:r>
-        <w:rPr>
-          <w:rFonts w:ascii="Times New Roman" w:hAnsi="Times New Roman" w:cs="Times New Roman"/>
-          <w:b/>
-          <w:bCs/>
-          <w:lang w:val="en-US"/>
-        </w:rPr>
-        <w:t>Aprobado</w:t>
-      </w:r>
-      <w:proofErr w:type="spellEnd"/>
-      <w:r>
-        <w:rPr>
-          <w:rFonts w:ascii="Times New Roman" w:hAnsi="Times New Roman" w:cs="Times New Roman"/>
-          <w:b/>
-          <w:bCs/>
-          <w:lang w:val="en-US"/>
-        </w:rPr>
-        <w:t>):</w:t>
+        <w:t>Candidato 1 (Aprobado):</w:t>
       </w:r>
       <w:r>
         <w:rPr>
@@ -1047,42 +924,14 @@
         </w:rPr>
         <w:t xml:space="preserve"> </w:t>
       </w:r>
-      <w:hyperlink r:id="rId14" w:tooltip="null" w:history="1">
-        <w:proofErr w:type="spellStart"/>
+      <w:hyperlink r:id="rId15" w:tooltip="null" w:history="1">
         <w:r>
           <w:rPr>
             <w:rStyle w:val="Hipervnculo"/>
             <w:rFonts w:ascii="Times New Roman" w:hAnsi="Times New Roman" w:cs="Times New Roman"/>
             <w:lang w:val="en-US"/>
           </w:rPr>
-          <w:t>SetFit</w:t>
-        </w:r>
-        <w:proofErr w:type="spellEnd"/>
-        <w:r>
-          <w:rPr>
-            <w:rStyle w:val="Hipervnculo"/>
-            <w:rFonts w:ascii="Times New Roman" w:hAnsi="Times New Roman" w:cs="Times New Roman"/>
-            <w:lang w:val="en-US"/>
-          </w:rPr>
-          <w:t>/</w:t>
-        </w:r>
-        <w:proofErr w:type="spellStart"/>
-        <w:r>
-          <w:rPr>
-            <w:rStyle w:val="Hipervnculo"/>
-            <w:rFonts w:ascii="Times New Roman" w:hAnsi="Times New Roman" w:cs="Times New Roman"/>
-            <w:lang w:val="en-US"/>
-          </w:rPr>
-          <w:t>amazon_reviews_multi_es</w:t>
-        </w:r>
-        <w:proofErr w:type="spellEnd"/>
-        <w:r>
-          <w:rPr>
-            <w:rStyle w:val="Hipervnculo"/>
-            <w:rFonts w:ascii="Times New Roman" w:hAnsi="Times New Roman" w:cs="Times New Roman"/>
-            <w:lang w:val="en-US"/>
-          </w:rPr>
-          <w:t xml:space="preserve"> (Hugging Face Datasets)</w:t>
+          <w:t>SetFit/amazon_reviews_multi_es (Hugging Face Datasets)</w:t>
         </w:r>
       </w:hyperlink>
     </w:p>
@@ -1105,27 +954,7 @@
           <w:bCs/>
           <w:lang w:val="en-US"/>
         </w:rPr>
-        <w:t>Candidato 2 (</w:t>
-      </w:r>
-      <w:proofErr w:type="spellStart"/>
-      <w:r>
-        <w:rPr>
-          <w:rFonts w:ascii="Times New Roman" w:hAnsi="Times New Roman" w:cs="Times New Roman"/>
-          <w:b/>
-          <w:bCs/>
-          <w:lang w:val="en-US"/>
-        </w:rPr>
-        <w:t>Descartado</w:t>
-      </w:r>
-      <w:proofErr w:type="spellEnd"/>
-      <w:r>
-        <w:rPr>
-          <w:rFonts w:ascii="Times New Roman" w:hAnsi="Times New Roman" w:cs="Times New Roman"/>
-          <w:b/>
-          <w:bCs/>
-          <w:lang w:val="en-US"/>
-        </w:rPr>
-        <w:t>):</w:t>
+        <w:t>Candidato 2 (Descartado):</w:t>
       </w:r>
       <w:r>
         <w:rPr>
@@ -1134,7 +963,7 @@
         </w:rPr>
         <w:t xml:space="preserve"> </w:t>
       </w:r>
-      <w:hyperlink r:id="rId15" w:tooltip="null" w:history="1">
+      <w:hyperlink r:id="rId16" w:tooltip="null" w:history="1">
         <w:r>
           <w:rPr>
             <w:rStyle w:val="Hipervnculo"/>
@@ -1271,33 +1100,7 @@
                 <w:lang w:eastAsia="es-DO"/>
                 <w14:ligatures w14:val="none"/>
               </w:rPr>
-              <w:t xml:space="preserve">Candidato 1 (Aprobado): Amazon </w:t>
-            </w:r>
-            <w:proofErr w:type="spellStart"/>
-            <w:r>
-              <w:rPr>
-                <w:rFonts w:ascii="Times New Roman" w:eastAsia="Times New Roman" w:hAnsi="Times New Roman" w:cs="Times New Roman"/>
-                <w:b/>
-                <w:bCs/>
-                <w:color w:val="000000"/>
-                <w:kern w:val="0"/>
-                <w:lang w:eastAsia="es-DO"/>
-                <w14:ligatures w14:val="none"/>
-              </w:rPr>
-              <w:t>Reviews</w:t>
-            </w:r>
-            <w:proofErr w:type="spellEnd"/>
-            <w:r>
-              <w:rPr>
-                <w:rFonts w:ascii="Times New Roman" w:eastAsia="Times New Roman" w:hAnsi="Times New Roman" w:cs="Times New Roman"/>
-                <w:b/>
-                <w:bCs/>
-                <w:color w:val="000000"/>
-                <w:kern w:val="0"/>
-                <w:lang w:eastAsia="es-DO"/>
-                <w14:ligatures w14:val="none"/>
-              </w:rPr>
-              <w:t xml:space="preserve"> Multi (es)</w:t>
+              <w:t>Candidato 1 (Aprobado): Amazon Reviews Multi (es)</w:t>
             </w:r>
           </w:p>
         </w:tc>
@@ -1337,33 +1140,7 @@
                 <w:lang w:eastAsia="es-DO"/>
                 <w14:ligatures w14:val="none"/>
               </w:rPr>
-              <w:t xml:space="preserve">Candidato 2 (Descartado): SMS Spam </w:t>
-            </w:r>
-            <w:proofErr w:type="spellStart"/>
-            <w:r>
-              <w:rPr>
-                <w:rFonts w:ascii="Times New Roman" w:eastAsia="Times New Roman" w:hAnsi="Times New Roman" w:cs="Times New Roman"/>
-                <w:b/>
-                <w:bCs/>
-                <w:color w:val="000000"/>
-                <w:kern w:val="0"/>
-                <w:lang w:eastAsia="es-DO"/>
-                <w14:ligatures w14:val="none"/>
-              </w:rPr>
-              <w:t>Collection</w:t>
-            </w:r>
-            <w:proofErr w:type="spellEnd"/>
-            <w:r>
-              <w:rPr>
-                <w:rFonts w:ascii="Times New Roman" w:eastAsia="Times New Roman" w:hAnsi="Times New Roman" w:cs="Times New Roman"/>
-                <w:b/>
-                <w:bCs/>
-                <w:color w:val="000000"/>
-                <w:kern w:val="0"/>
-                <w:lang w:eastAsia="es-DO"/>
-                <w14:ligatures w14:val="none"/>
-              </w:rPr>
-              <w:t xml:space="preserve"> (UCI)</w:t>
+              <w:t>Candidato 2 (Descartado): SMS Spam Collection (UCI)</w:t>
             </w:r>
           </w:p>
         </w:tc>
@@ -1461,51 +1238,7 @@
                 <w:lang w:eastAsia="es-DO"/>
                 <w14:ligatures w14:val="none"/>
               </w:rPr>
-              <w:t xml:space="preserve"> Contiene textos de reseñas de productos en español (</w:t>
-            </w:r>
-            <w:proofErr w:type="spellStart"/>
-            <w:r>
-              <w:rPr>
-                <w:rFonts w:ascii="Times New Roman" w:eastAsia="Times New Roman" w:hAnsi="Times New Roman" w:cs="Times New Roman"/>
-                <w:color w:val="000000"/>
-                <w:kern w:val="0"/>
-                <w:lang w:eastAsia="es-DO"/>
-                <w14:ligatures w14:val="none"/>
-              </w:rPr>
-              <w:t>text</w:t>
-            </w:r>
-            <w:proofErr w:type="spellEnd"/>
-            <w:r>
-              <w:rPr>
-                <w:rFonts w:ascii="Times New Roman" w:eastAsia="Times New Roman" w:hAnsi="Times New Roman" w:cs="Times New Roman"/>
-                <w:color w:val="000000"/>
-                <w:kern w:val="0"/>
-                <w:lang w:eastAsia="es-DO"/>
-                <w14:ligatures w14:val="none"/>
-              </w:rPr>
-              <w:t xml:space="preserve"> / </w:t>
-            </w:r>
-            <w:proofErr w:type="spellStart"/>
-            <w:r>
-              <w:rPr>
-                <w:rFonts w:ascii="Times New Roman" w:eastAsia="Times New Roman" w:hAnsi="Times New Roman" w:cs="Times New Roman"/>
-                <w:color w:val="000000"/>
-                <w:kern w:val="0"/>
-                <w:lang w:eastAsia="es-DO"/>
-                <w14:ligatures w14:val="none"/>
-              </w:rPr>
-              <w:t>label_text</w:t>
-            </w:r>
-            <w:proofErr w:type="spellEnd"/>
-            <w:r>
-              <w:rPr>
-                <w:rFonts w:ascii="Times New Roman" w:eastAsia="Times New Roman" w:hAnsi="Times New Roman" w:cs="Times New Roman"/>
-                <w:color w:val="000000"/>
-                <w:kern w:val="0"/>
-                <w:lang w:eastAsia="es-DO"/>
-                <w14:ligatures w14:val="none"/>
-              </w:rPr>
-              <w:t>) con etiquetas explícitas de sentimiento o calificación en estrellas (1 a 5), idóneas para tareas complejas de PLN.</w:t>
+              <w:t xml:space="preserve"> Contiene textos de reseñas de productos en español (text / label_text) con etiquetas explícitas de sentimiento o calificación en estrellas (1 a 5), idóneas para tareas complejas de PLN.</w:t>
             </w:r>
           </w:p>
         </w:tc>
@@ -1556,29 +1289,7 @@
                 <w:lang w:eastAsia="es-DO"/>
                 <w14:ligatures w14:val="none"/>
               </w:rPr>
-              <w:t xml:space="preserve"> Textos breves de mensajes de texto SMS con etiquetas binarias (</w:t>
-            </w:r>
-            <w:proofErr w:type="spellStart"/>
-            <w:r>
-              <w:rPr>
-                <w:rFonts w:ascii="Times New Roman" w:eastAsia="Times New Roman" w:hAnsi="Times New Roman" w:cs="Times New Roman"/>
-                <w:color w:val="000000"/>
-                <w:kern w:val="0"/>
-                <w:lang w:eastAsia="es-DO"/>
-                <w14:ligatures w14:val="none"/>
-              </w:rPr>
-              <w:t>ham</w:t>
-            </w:r>
-            <w:proofErr w:type="spellEnd"/>
-            <w:r>
-              <w:rPr>
-                <w:rFonts w:ascii="Times New Roman" w:eastAsia="Times New Roman" w:hAnsi="Times New Roman" w:cs="Times New Roman"/>
-                <w:color w:val="000000"/>
-                <w:kern w:val="0"/>
-                <w:lang w:eastAsia="es-DO"/>
-                <w14:ligatures w14:val="none"/>
-              </w:rPr>
-              <w:t>/spam). Responde a detección de spam pero no al análisis de sentimiento/opinión.</w:t>
+              <w:t xml:space="preserve"> Textos breves de mensajes de texto SMS con etiquetas binarias (ham/spam). Responde a detección de spam pero no al análisis de sentimiento/opinión.</w:t>
             </w:r>
           </w:p>
         </w:tc>
@@ -2035,7 +1746,6 @@
                 <w:lang w:eastAsia="es-DO"/>
                 <w14:ligatures w14:val="none"/>
               </w:rPr>
-              <w:lastRenderedPageBreak/>
               <w:t>¿Se permite descargar, analizar y publicar resultados derivados?</w:t>
             </w:r>
           </w:p>
@@ -2348,7 +2058,18 @@
                 <w:lang w:eastAsia="es-DO"/>
                 <w14:ligatures w14:val="none"/>
               </w:rPr>
-              <w:t xml:space="preserve"> Lenguaje oral no estandarizado y dominios no comerciales.</w:t>
+              <w:t xml:space="preserve"> </w:t>
+            </w:r>
+            <w:r>
+              <w:rPr>
+                <w:rFonts w:ascii="Times New Roman" w:eastAsia="Times New Roman" w:hAnsi="Times New Roman" w:cs="Times New Roman"/>
+                <w:color w:val="000000"/>
+                <w:kern w:val="0"/>
+                <w:lang w:eastAsia="es-DO"/>
+                <w14:ligatures w14:val="none"/>
+              </w:rPr>
+              <w:lastRenderedPageBreak/>
+              <w:t>Lenguaje oral no estandarizado y dominios no comerciales.</w:t>
             </w:r>
           </w:p>
         </w:tc>
@@ -2389,6 +2110,7 @@
                 <w:lang w:eastAsia="es-DO"/>
                 <w14:ligatures w14:val="none"/>
               </w:rPr>
+              <w:lastRenderedPageBreak/>
               <w:t>Idioma:</w:t>
             </w:r>
             <w:r>
@@ -2421,7 +2143,18 @@
                 <w:lang w:eastAsia="es-DO"/>
                 <w14:ligatures w14:val="none"/>
               </w:rPr>
-              <w:t xml:space="preserve"> Toda la población hispanohablante. Además, está sesgado a patrones de mensajería SMS informal de los años 2000.</w:t>
+              <w:t xml:space="preserve"> Toda la población hispanohablante. Además, está sesgado a patrones </w:t>
+            </w:r>
+            <w:r>
+              <w:rPr>
+                <w:rFonts w:ascii="Times New Roman" w:eastAsia="Times New Roman" w:hAnsi="Times New Roman" w:cs="Times New Roman"/>
+                <w:color w:val="000000"/>
+                <w:kern w:val="0"/>
+                <w:lang w:eastAsia="es-DO"/>
+                <w14:ligatures w14:val="none"/>
+              </w:rPr>
+              <w:lastRenderedPageBreak/>
+              <w:t>de mensajería SMS informal de los años 2000.</w:t>
             </w:r>
           </w:p>
         </w:tc>
@@ -2487,6 +2220,7 @@
                 <w:lang w:eastAsia="es-DO"/>
                 <w14:ligatures w14:val="none"/>
               </w:rPr>
+              <w:lastRenderedPageBreak/>
               <w:t>¿Qué población, idioma, periodo o grupos quedan fuera?</w:t>
             </w:r>
           </w:p>
@@ -3184,117 +2918,7 @@
                 <w:lang w:eastAsia="es-DO"/>
                 <w14:ligatures w14:val="none"/>
               </w:rPr>
-              <w:t xml:space="preserve"> Accesible mediante la API de </w:t>
-            </w:r>
-            <w:proofErr w:type="spellStart"/>
-            <w:r>
-              <w:rPr>
-                <w:rFonts w:ascii="Times New Roman" w:eastAsia="Times New Roman" w:hAnsi="Times New Roman" w:cs="Times New Roman"/>
-                <w:color w:val="000000"/>
-                <w:kern w:val="0"/>
-                <w:lang w:eastAsia="es-DO"/>
-                <w14:ligatures w14:val="none"/>
-              </w:rPr>
-              <w:t>Hugging</w:t>
-            </w:r>
-            <w:proofErr w:type="spellEnd"/>
-            <w:r>
-              <w:rPr>
-                <w:rFonts w:ascii="Times New Roman" w:eastAsia="Times New Roman" w:hAnsi="Times New Roman" w:cs="Times New Roman"/>
-                <w:color w:val="000000"/>
-                <w:kern w:val="0"/>
-                <w:lang w:eastAsia="es-DO"/>
-                <w14:ligatures w14:val="none"/>
-              </w:rPr>
-              <w:t xml:space="preserve"> </w:t>
-            </w:r>
-            <w:proofErr w:type="spellStart"/>
-            <w:r>
-              <w:rPr>
-                <w:rFonts w:ascii="Times New Roman" w:eastAsia="Times New Roman" w:hAnsi="Times New Roman" w:cs="Times New Roman"/>
-                <w:color w:val="000000"/>
-                <w:kern w:val="0"/>
-                <w:lang w:eastAsia="es-DO"/>
-                <w14:ligatures w14:val="none"/>
-              </w:rPr>
-              <w:t>Face</w:t>
-            </w:r>
-            <w:proofErr w:type="spellEnd"/>
-            <w:r>
-              <w:rPr>
-                <w:rFonts w:ascii="Times New Roman" w:eastAsia="Times New Roman" w:hAnsi="Times New Roman" w:cs="Times New Roman"/>
-                <w:color w:val="000000"/>
-                <w:kern w:val="0"/>
-                <w:lang w:eastAsia="es-DO"/>
-                <w14:ligatures w14:val="none"/>
-              </w:rPr>
-              <w:t xml:space="preserve"> </w:t>
-            </w:r>
-            <w:proofErr w:type="spellStart"/>
-            <w:r>
-              <w:rPr>
-                <w:rFonts w:ascii="Times New Roman" w:eastAsia="Times New Roman" w:hAnsi="Times New Roman" w:cs="Times New Roman"/>
-                <w:color w:val="000000"/>
-                <w:kern w:val="0"/>
-                <w:lang w:eastAsia="es-DO"/>
-                <w14:ligatures w14:val="none"/>
-              </w:rPr>
-              <w:t>Datasets</w:t>
-            </w:r>
-            <w:proofErr w:type="spellEnd"/>
-            <w:r>
-              <w:rPr>
-                <w:rFonts w:ascii="Times New Roman" w:eastAsia="Times New Roman" w:hAnsi="Times New Roman" w:cs="Times New Roman"/>
-                <w:color w:val="000000"/>
-                <w:kern w:val="0"/>
-                <w:lang w:eastAsia="es-DO"/>
-                <w14:ligatures w14:val="none"/>
-              </w:rPr>
-              <w:t xml:space="preserve"> (</w:t>
-            </w:r>
-            <w:proofErr w:type="spellStart"/>
-            <w:r>
-              <w:rPr>
-                <w:rFonts w:ascii="Times New Roman" w:eastAsia="Times New Roman" w:hAnsi="Times New Roman" w:cs="Times New Roman"/>
-                <w:color w:val="000000"/>
-                <w:kern w:val="0"/>
-                <w:lang w:eastAsia="es-DO"/>
-                <w14:ligatures w14:val="none"/>
-              </w:rPr>
-              <w:t>SetFit</w:t>
-            </w:r>
-            <w:proofErr w:type="spellEnd"/>
-            <w:r>
-              <w:rPr>
-                <w:rFonts w:ascii="Times New Roman" w:eastAsia="Times New Roman" w:hAnsi="Times New Roman" w:cs="Times New Roman"/>
-                <w:color w:val="000000"/>
-                <w:kern w:val="0"/>
-                <w:lang w:eastAsia="es-DO"/>
-                <w14:ligatures w14:val="none"/>
-              </w:rPr>
-              <w:t>/</w:t>
-            </w:r>
-            <w:proofErr w:type="spellStart"/>
-            <w:r>
-              <w:rPr>
-                <w:rFonts w:ascii="Times New Roman" w:eastAsia="Times New Roman" w:hAnsi="Times New Roman" w:cs="Times New Roman"/>
-                <w:color w:val="000000"/>
-                <w:kern w:val="0"/>
-                <w:lang w:eastAsia="es-DO"/>
-                <w14:ligatures w14:val="none"/>
-              </w:rPr>
-              <w:t>amazon_reviews_multi_es</w:t>
-            </w:r>
-            <w:proofErr w:type="spellEnd"/>
-            <w:r>
-              <w:rPr>
-                <w:rFonts w:ascii="Times New Roman" w:eastAsia="Times New Roman" w:hAnsi="Times New Roman" w:cs="Times New Roman"/>
-                <w:color w:val="000000"/>
-                <w:kern w:val="0"/>
-                <w:lang w:eastAsia="es-DO"/>
-                <w14:ligatures w14:val="none"/>
-              </w:rPr>
-              <w:t>) o mediante enlace directo público sin autenticación privada.</w:t>
+              <w:t xml:space="preserve"> Accesible mediante la API de Hugging Face Datasets (SetFit/amazon_reviews_multi_es) o mediante enlace directo público sin autenticación privada.</w:t>
             </w:r>
           </w:p>
         </w:tc>
@@ -3345,29 +2969,7 @@
                 <w:lang w:eastAsia="es-DO"/>
                 <w14:ligatures w14:val="none"/>
               </w:rPr>
-              <w:t xml:space="preserve"> Disponible de forma estática y permanente en el portal oficial de UCI Machine Learning </w:t>
-            </w:r>
-            <w:proofErr w:type="spellStart"/>
-            <w:r>
-              <w:rPr>
-                <w:rFonts w:ascii="Times New Roman" w:eastAsia="Times New Roman" w:hAnsi="Times New Roman" w:cs="Times New Roman"/>
-                <w:color w:val="000000"/>
-                <w:kern w:val="0"/>
-                <w:lang w:eastAsia="es-DO"/>
-                <w14:ligatures w14:val="none"/>
-              </w:rPr>
-              <w:t>Repository</w:t>
-            </w:r>
-            <w:proofErr w:type="spellEnd"/>
-            <w:r>
-              <w:rPr>
-                <w:rFonts w:ascii="Times New Roman" w:eastAsia="Times New Roman" w:hAnsi="Times New Roman" w:cs="Times New Roman"/>
-                <w:color w:val="000000"/>
-                <w:kern w:val="0"/>
-                <w:lang w:eastAsia="es-DO"/>
-                <w14:ligatures w14:val="none"/>
-              </w:rPr>
-              <w:t>.</w:t>
+              <w:t xml:space="preserve"> Disponible de forma estática y permanente en el portal oficial de UCI Machine Learning Repository.</w:t>
             </w:r>
           </w:p>
         </w:tc>
@@ -4246,63 +3848,13 @@
           <w:b/>
           <w:bCs/>
         </w:rPr>
-        <w:t>Aprobación de Candidate 1 (</w:t>
-      </w:r>
-      <w:proofErr w:type="spellStart"/>
-      <w:r>
-        <w:rPr>
-          <w:rFonts w:ascii="Times New Roman" w:hAnsi="Times New Roman" w:cs="Times New Roman"/>
-          <w:b/>
-          <w:bCs/>
-        </w:rPr>
-        <w:t>SetFit</w:t>
-      </w:r>
-      <w:proofErr w:type="spellEnd"/>
-      <w:r>
-        <w:rPr>
-          <w:rFonts w:ascii="Times New Roman" w:hAnsi="Times New Roman" w:cs="Times New Roman"/>
-          <w:b/>
-          <w:bCs/>
-        </w:rPr>
-        <w:t>/</w:t>
-      </w:r>
-      <w:proofErr w:type="spellStart"/>
-      <w:r>
-        <w:rPr>
-          <w:rFonts w:ascii="Times New Roman" w:hAnsi="Times New Roman" w:cs="Times New Roman"/>
-          <w:b/>
-          <w:bCs/>
-        </w:rPr>
-        <w:t>amazon_reviews_multi_es</w:t>
-      </w:r>
-      <w:proofErr w:type="spellEnd"/>
-      <w:r>
-        <w:rPr>
-          <w:rFonts w:ascii="Times New Roman" w:hAnsi="Times New Roman" w:cs="Times New Roman"/>
-          <w:b/>
-          <w:bCs/>
-        </w:rPr>
-        <w:t>):</w:t>
+        <w:t>Aprobación de Candidate 1 (SetFit/amazon_reviews_multi_es):</w:t>
       </w:r>
       <w:r>
         <w:rPr>
           <w:rFonts w:ascii="Times New Roman" w:hAnsi="Times New Roman" w:cs="Times New Roman"/>
         </w:rPr>
-        <w:t xml:space="preserve"> Cumple con todos los requisitos de pertinencia en español, equilibrio de clases para evitar métricas engañosas (como el </w:t>
-      </w:r>
-      <w:proofErr w:type="spellStart"/>
-      <w:r>
-        <w:rPr>
-          <w:rFonts w:ascii="Times New Roman" w:hAnsi="Times New Roman" w:cs="Times New Roman"/>
-        </w:rPr>
-        <w:t>accuracy</w:t>
-      </w:r>
-      <w:proofErr w:type="spellEnd"/>
-      <w:r>
-        <w:rPr>
-          <w:rFonts w:ascii="Times New Roman" w:hAnsi="Times New Roman" w:cs="Times New Roman"/>
-        </w:rPr>
-        <w:t xml:space="preserve"> aislado), licencia abierta CC-BY-4.0 y fácil integración en los contratos de validación de datos.</w:t>
+        <w:t xml:space="preserve"> Cumple con todos los requisitos de pertinencia en español, equilibrio de clases para evitar métricas engañosas (como el accuracy aislado), licencia abierta CC-BY-4.0 y fácil integración en los contratos de validación de datos.</w:t>
       </w:r>
     </w:p>
     <w:p>
@@ -4322,25 +3874,8 @@
           <w:b/>
           <w:bCs/>
         </w:rPr>
-        <w:t xml:space="preserve">Descarte de Candidate 2 (SMS Spam </w:t>
-      </w:r>
-      <w:proofErr w:type="spellStart"/>
-      <w:r>
-        <w:rPr>
-          <w:rFonts w:ascii="Times New Roman" w:hAnsi="Times New Roman" w:cs="Times New Roman"/>
-          <w:b/>
-          <w:bCs/>
-        </w:rPr>
-        <w:t>Collection</w:t>
-      </w:r>
-      <w:proofErr w:type="spellEnd"/>
-      <w:r>
-        <w:rPr>
-          <w:rFonts w:ascii="Times New Roman" w:hAnsi="Times New Roman" w:cs="Times New Roman"/>
-          <w:b/>
-          <w:bCs/>
-        </w:rPr>
-        <w:t>):</w:t>
+        <w:lastRenderedPageBreak/>
+        <w:t>Descarte de Candidate 2 (SMS Spam Collection):</w:t>
       </w:r>
       <w:r>
         <w:rPr>
@@ -4356,6 +3891,7 @@
           <w:rFonts w:ascii="Times New Roman" w:hAnsi="Times New Roman" w:cs="Times New Roman"/>
           <w:b/>
           <w:bCs/>
+          <w:lang w:val="en-US"/>
         </w:rPr>
       </w:pPr>
       <w:r>
@@ -4363,6 +3899,7 @@
           <w:rFonts w:ascii="Times New Roman" w:hAnsi="Times New Roman" w:cs="Times New Roman"/>
           <w:b/>
           <w:bCs/>
+          <w:lang w:val="en-US"/>
         </w:rPr>
         <w:t>Dataset</w:t>
       </w:r>
@@ -4380,23 +3917,7 @@
           <w:rFonts w:ascii="Times New Roman" w:hAnsi="Times New Roman" w:cs="Times New Roman"/>
           <w:lang w:val="en-US"/>
         </w:rPr>
-        <w:t>DATA_SOURCE=</w:t>
-      </w:r>
-      <w:proofErr w:type="spellStart"/>
-      <w:r>
-        <w:rPr>
-          <w:rFonts w:ascii="Times New Roman" w:hAnsi="Times New Roman" w:cs="Times New Roman"/>
-          <w:lang w:val="en-US"/>
-        </w:rPr>
-        <w:t>url</w:t>
-      </w:r>
-      <w:proofErr w:type="spellEnd"/>
-      <w:r>
-        <w:rPr>
-          <w:rFonts w:ascii="Times New Roman" w:hAnsi="Times New Roman" w:cs="Times New Roman"/>
-          <w:lang w:val="en-US"/>
-        </w:rPr>
-        <w:t xml:space="preserve"> DATASET_URL=https://huggingface.co/datasets/SetFit/amazon_reviews_multi_es/raw/main/train.csv </w:t>
+        <w:t xml:space="preserve">DATA_SOURCE=url DATASET_URL=https://huggingface.co/datasets/SetFit/amazon_reviews_multi_es/raw/main/train.csv </w:t>
       </w:r>
     </w:p>
     <w:p>
@@ -4428,17 +3949,8 @@
           <w:rFonts w:ascii="Times New Roman" w:hAnsi="Times New Roman" w:cs="Times New Roman"/>
           <w:lang w:val="en-US"/>
         </w:rPr>
-        <w:t>TEXT_COLUMN=</w:t>
+        <w:t>TEXT_COLUMN=review_body</w:t>
       </w:r>
-      <w:proofErr w:type="spellStart"/>
-      <w:r>
-        <w:rPr>
-          <w:rFonts w:ascii="Times New Roman" w:hAnsi="Times New Roman" w:cs="Times New Roman"/>
-          <w:lang w:val="en-US"/>
-        </w:rPr>
-        <w:t>review_body</w:t>
-      </w:r>
-      <w:proofErr w:type="spellEnd"/>
     </w:p>
     <w:p>
       <w:pPr>
@@ -4467,35 +3979,7 @@
         <w:rPr>
           <w:rFonts w:ascii="Times New Roman" w:hAnsi="Times New Roman" w:cs="Times New Roman"/>
         </w:rPr>
-        <w:t xml:space="preserve">Complete </w:t>
-      </w:r>
-      <w:proofErr w:type="spellStart"/>
-      <w:r>
-        <w:rPr>
-          <w:rFonts w:ascii="Times New Roman" w:hAnsi="Times New Roman" w:cs="Times New Roman"/>
-        </w:rPr>
-        <w:t>docs</w:t>
-      </w:r>
-      <w:proofErr w:type="spellEnd"/>
-      <w:r>
-        <w:rPr>
-          <w:rFonts w:ascii="Times New Roman" w:hAnsi="Times New Roman" w:cs="Times New Roman"/>
-        </w:rPr>
-        <w:t>/DATASET_CARD.md, el diccionario de datos (</w:t>
-      </w:r>
-      <w:proofErr w:type="spellStart"/>
-      <w:r>
-        <w:rPr>
-          <w:rFonts w:ascii="Times New Roman" w:hAnsi="Times New Roman" w:cs="Times New Roman"/>
-        </w:rPr>
-        <w:t>docs</w:t>
-      </w:r>
-      <w:proofErr w:type="spellEnd"/>
-      <w:r>
-        <w:rPr>
-          <w:rFonts w:ascii="Times New Roman" w:hAnsi="Times New Roman" w:cs="Times New Roman"/>
-        </w:rPr>
-        <w:t>/dataset_candidates.csv), la licencia y el procedimiento de obtención. El archivo data/sample/demo_text.csv solamente comprueba la arquitectura.</w:t>
+        <w:t>Complete docs/DATASET_CARD.md, el diccionario de datos (docs/dataset_candidates.csv), la licencia y el procedimiento de obtención. El archivo data/sample/demo_text.csv solamente comprueba la arquitectura.</w:t>
       </w:r>
     </w:p>
     <w:p>
@@ -4516,7 +4000,6 @@
           <w:lang w:val="en-US"/>
         </w:rPr>
       </w:pPr>
-      <w:proofErr w:type="spellStart"/>
       <w:r>
         <w:rPr>
           <w:rFonts w:ascii="Times New Roman" w:hAnsi="Times New Roman" w:cs="Times New Roman"/>
@@ -4526,7 +4009,6 @@
         </w:rPr>
         <w:t>Entrenamiento</w:t>
       </w:r>
-      <w:proofErr w:type="spellEnd"/>
     </w:p>
     <w:p>
       <w:pPr>
@@ -4536,21 +4018,12 @@
           <w:lang w:val="en-US"/>
         </w:rPr>
       </w:pPr>
-      <w:proofErr w:type="spellStart"/>
       <w:r>
         <w:rPr>
           <w:rFonts w:ascii="Times New Roman" w:hAnsi="Times New Roman" w:cs="Times New Roman"/>
           <w:lang w:val="en-US"/>
         </w:rPr>
-        <w:t>uv</w:t>
-      </w:r>
-      <w:proofErr w:type="spellEnd"/>
-      <w:r>
-        <w:rPr>
-          <w:rFonts w:ascii="Times New Roman" w:hAnsi="Times New Roman" w:cs="Times New Roman"/>
-          <w:lang w:val="en-US"/>
-        </w:rPr>
-        <w:t xml:space="preserve"> run python scripts/train_text.py</w:t>
+        <w:t>uv run python scripts/train_text.py</w:t>
       </w:r>
     </w:p>
     <w:p>
@@ -4561,37 +4034,12 @@
           <w:lang w:val="en-US"/>
         </w:rPr>
       </w:pPr>
-      <w:proofErr w:type="spellStart"/>
       <w:r>
         <w:rPr>
           <w:rFonts w:ascii="Times New Roman" w:hAnsi="Times New Roman" w:cs="Times New Roman"/>
           <w:lang w:val="en-US"/>
         </w:rPr>
-        <w:t>uv</w:t>
-      </w:r>
-      <w:proofErr w:type="spellEnd"/>
-      <w:r>
-        <w:rPr>
-          <w:rFonts w:ascii="Times New Roman" w:hAnsi="Times New Roman" w:cs="Times New Roman"/>
-          <w:lang w:val="en-US"/>
-        </w:rPr>
-        <w:t xml:space="preserve"> run </w:t>
-      </w:r>
-      <w:proofErr w:type="spellStart"/>
-      <w:r>
-        <w:rPr>
-          <w:rFonts w:ascii="Times New Roman" w:hAnsi="Times New Roman" w:cs="Times New Roman"/>
-          <w:lang w:val="en-US"/>
-        </w:rPr>
-        <w:t>streamlit</w:t>
-      </w:r>
-      <w:proofErr w:type="spellEnd"/>
-      <w:r>
-        <w:rPr>
-          <w:rFonts w:ascii="Times New Roman" w:hAnsi="Times New Roman" w:cs="Times New Roman"/>
-          <w:lang w:val="en-US"/>
-        </w:rPr>
-        <w:t xml:space="preserve"> run app/streamlit_app.py</w:t>
+        <w:t>uv run streamlit run app/streamlit_app.py</w:t>
       </w:r>
     </w:p>
     <w:p>
@@ -4608,6 +4056,7 @@
         <w:jc w:val="both"/>
         <w:rPr>
           <w:rFonts w:ascii="Times New Roman" w:hAnsi="Times New Roman" w:cs="Times New Roman"/>
+          <w:lang w:val="en-US"/>
         </w:rPr>
       </w:pPr>
     </w:p>
@@ -4616,6 +4065,7 @@
         <w:jc w:val="both"/>
         <w:rPr>
           <w:rFonts w:ascii="Times New Roman" w:hAnsi="Times New Roman" w:cs="Times New Roman"/>
+          <w:lang w:val="en-US"/>
         </w:rPr>
       </w:pPr>
     </w:p>
@@ -4624,6 +4074,7 @@
         <w:jc w:val="both"/>
         <w:rPr>
           <w:rFonts w:ascii="Times New Roman" w:hAnsi="Times New Roman" w:cs="Times New Roman"/>
+          <w:lang w:val="en-US"/>
         </w:rPr>
       </w:pPr>
     </w:p>
@@ -4632,6 +4083,7 @@
         <w:jc w:val="both"/>
         <w:rPr>
           <w:rFonts w:ascii="Times New Roman" w:hAnsi="Times New Roman" w:cs="Times New Roman"/>
+          <w:lang w:val="en-US"/>
         </w:rPr>
       </w:pPr>
     </w:p>
@@ -4645,6 +4097,7 @@
       <w:r>
         <w:rPr>
           <w:rFonts w:ascii="Times New Roman" w:hAnsi="Times New Roman" w:cs="Times New Roman"/>
+          <w:noProof/>
         </w:rPr>
         <w:lastRenderedPageBreak/>
         <w:drawing>
@@ -4660,54 +4113,6 @@
                 <pic:pic xmlns:pic="http://schemas.openxmlformats.org/drawingml/2006/picture">
                   <pic:nvPicPr>
                     <pic:cNvPr id="1475926865" name=""/>
-                    <pic:cNvPicPr/>
-                  </pic:nvPicPr>
-                  <pic:blipFill>
-                    <a:blip r:embed="rId16"/>
-                    <a:stretch>
-                      <a:fillRect/>
-                    </a:stretch>
-                  </pic:blipFill>
-                  <pic:spPr>
-                    <a:xfrm>
-                      <a:off x="0" y="0"/>
-                      <a:ext cx="5943600" cy="3425825"/>
-                    </a:xfrm>
-                    <a:prstGeom prst="rect">
-                      <a:avLst/>
-                    </a:prstGeom>
-                  </pic:spPr>
-                </pic:pic>
-              </a:graphicData>
-            </a:graphic>
-          </wp:inline>
-        </w:drawing>
-      </w:r>
-    </w:p>
-    <w:p>
-      <w:pPr>
-        <w:jc w:val="both"/>
-        <w:rPr>
-          <w:rFonts w:ascii="Times New Roman" w:hAnsi="Times New Roman" w:cs="Times New Roman"/>
-        </w:rPr>
-      </w:pPr>
-      <w:r>
-        <w:rPr>
-          <w:rFonts w:ascii="Times New Roman" w:hAnsi="Times New Roman" w:cs="Times New Roman"/>
-        </w:rPr>
-        <w:drawing>
-          <wp:inline distT="0" distB="0" distL="0" distR="0" wp14:anchorId="6648446F" wp14:editId="7D763B53">
-            <wp:extent cx="5943600" cy="3425825"/>
-            <wp:effectExtent l="0" t="0" r="0" b="3175"/>
-            <wp:docPr id="1876865797" name="Imagen 1"/>
-            <wp:cNvGraphicFramePr>
-              <a:graphicFrameLocks xmlns:a="http://schemas.openxmlformats.org/drawingml/2006/main" noChangeAspect="1"/>
-            </wp:cNvGraphicFramePr>
-            <a:graphic xmlns:a="http://schemas.openxmlformats.org/drawingml/2006/main">
-              <a:graphicData uri="http://schemas.openxmlformats.org/drawingml/2006/picture">
-                <pic:pic xmlns:pic="http://schemas.openxmlformats.org/drawingml/2006/picture">
-                  <pic:nvPicPr>
-                    <pic:cNvPr id="1876865797" name=""/>
                     <pic:cNvPicPr/>
                   </pic:nvPicPr>
                   <pic:blipFill>
@@ -4742,6 +4147,56 @@
       <w:r>
         <w:rPr>
           <w:rFonts w:ascii="Times New Roman" w:hAnsi="Times New Roman" w:cs="Times New Roman"/>
+          <w:noProof/>
+        </w:rPr>
+        <w:drawing>
+          <wp:inline distT="0" distB="0" distL="0" distR="0" wp14:anchorId="6648446F" wp14:editId="7D763B53">
+            <wp:extent cx="5943600" cy="3425825"/>
+            <wp:effectExtent l="0" t="0" r="0" b="3175"/>
+            <wp:docPr id="1876865797" name="Imagen 1"/>
+            <wp:cNvGraphicFramePr>
+              <a:graphicFrameLocks xmlns:a="http://schemas.openxmlformats.org/drawingml/2006/main" noChangeAspect="1"/>
+            </wp:cNvGraphicFramePr>
+            <a:graphic xmlns:a="http://schemas.openxmlformats.org/drawingml/2006/main">
+              <a:graphicData uri="http://schemas.openxmlformats.org/drawingml/2006/picture">
+                <pic:pic xmlns:pic="http://schemas.openxmlformats.org/drawingml/2006/picture">
+                  <pic:nvPicPr>
+                    <pic:cNvPr id="1876865797" name=""/>
+                    <pic:cNvPicPr/>
+                  </pic:nvPicPr>
+                  <pic:blipFill>
+                    <a:blip r:embed="rId18"/>
+                    <a:stretch>
+                      <a:fillRect/>
+                    </a:stretch>
+                  </pic:blipFill>
+                  <pic:spPr>
+                    <a:xfrm>
+                      <a:off x="0" y="0"/>
+                      <a:ext cx="5943600" cy="3425825"/>
+                    </a:xfrm>
+                    <a:prstGeom prst="rect">
+                      <a:avLst/>
+                    </a:prstGeom>
+                  </pic:spPr>
+                </pic:pic>
+              </a:graphicData>
+            </a:graphic>
+          </wp:inline>
+        </w:drawing>
+      </w:r>
+    </w:p>
+    <w:p>
+      <w:pPr>
+        <w:jc w:val="both"/>
+        <w:rPr>
+          <w:rFonts w:ascii="Times New Roman" w:hAnsi="Times New Roman" w:cs="Times New Roman"/>
+        </w:rPr>
+      </w:pPr>
+      <w:r>
+        <w:rPr>
+          <w:rFonts w:ascii="Times New Roman" w:hAnsi="Times New Roman" w:cs="Times New Roman"/>
+          <w:noProof/>
         </w:rPr>
         <w:lastRenderedPageBreak/>
         <w:drawing>
@@ -4760,7 +4215,7 @@
                     <pic:cNvPicPr/>
                   </pic:nvPicPr>
                   <pic:blipFill>
-                    <a:blip r:embed="rId18"/>
+                    <a:blip r:embed="rId19"/>
                     <a:stretch>
                       <a:fillRect/>
                     </a:stretch>
@@ -4792,6 +4247,7 @@
       <w:r>
         <w:rPr>
           <w:rFonts w:ascii="Times New Roman" w:hAnsi="Times New Roman" w:cs="Times New Roman"/>
+          <w:noProof/>
           <w:lang w:val="en-US"/>
         </w:rPr>
         <w:lastRenderedPageBreak/>
@@ -4811,7 +4267,7 @@
                     <pic:cNvPicPr/>
                   </pic:nvPicPr>
                   <pic:blipFill>
-                    <a:blip r:embed="rId19"/>
+                    <a:blip r:embed="rId20"/>
                     <a:stretch>
                       <a:fillRect/>
                     </a:stretch>
@@ -4842,6 +4298,7 @@
       <w:r>
         <w:rPr>
           <w:rFonts w:ascii="Times New Roman" w:hAnsi="Times New Roman" w:cs="Times New Roman"/>
+          <w:noProof/>
         </w:rPr>
         <w:lastRenderedPageBreak/>
         <w:drawing>
@@ -4860,7 +4317,7 @@
                     <pic:cNvPicPr/>
                   </pic:nvPicPr>
                   <pic:blipFill>
-                    <a:blip r:embed="rId20"/>
+                    <a:blip r:embed="rId21"/>
                     <a:stretch>
                       <a:fillRect/>
                     </a:stretch>
@@ -4891,6 +4348,7 @@
       <w:r>
         <w:rPr>
           <w:rFonts w:ascii="Times New Roman" w:hAnsi="Times New Roman" w:cs="Times New Roman"/>
+          <w:noProof/>
         </w:rPr>
         <w:lastRenderedPageBreak/>
         <w:drawing>
@@ -4909,7 +4367,7 @@
                     <pic:cNvPicPr/>
                   </pic:nvPicPr>
                   <pic:blipFill>
-                    <a:blip r:embed="rId21"/>
+                    <a:blip r:embed="rId22"/>
                     <a:stretch>
                       <a:fillRect/>
                     </a:stretch>
@@ -4948,6 +4406,7 @@
       <w:r>
         <w:rPr>
           <w:rFonts w:ascii="Times New Roman" w:hAnsi="Times New Roman" w:cs="Times New Roman"/>
+          <w:noProof/>
         </w:rPr>
         <w:lastRenderedPageBreak/>
         <w:drawing>
@@ -4966,7 +4425,7 @@
                     <pic:cNvPicPr/>
                   </pic:nvPicPr>
                   <pic:blipFill>
-                    <a:blip r:embed="rId22"/>
+                    <a:blip r:embed="rId23"/>
                     <a:stretch>
                       <a:fillRect/>
                     </a:stretch>
@@ -4997,6 +4456,7 @@
       <w:r>
         <w:rPr>
           <w:rFonts w:ascii="Times New Roman" w:hAnsi="Times New Roman" w:cs="Times New Roman"/>
+          <w:noProof/>
         </w:rPr>
         <w:lastRenderedPageBreak/>
         <w:drawing>
@@ -5015,7 +4475,7 @@
                     <pic:cNvPicPr/>
                   </pic:nvPicPr>
                   <pic:blipFill>
-                    <a:blip r:embed="rId23"/>
+                    <a:blip r:embed="rId24"/>
                     <a:stretch>
                       <a:fillRect/>
                     </a:stretch>
@@ -5046,6 +4506,7 @@
       <w:r>
         <w:rPr>
           <w:rFonts w:ascii="Times New Roman" w:hAnsi="Times New Roman" w:cs="Times New Roman"/>
+          <w:noProof/>
         </w:rPr>
         <w:lastRenderedPageBreak/>
         <w:drawing>
@@ -5064,7 +4525,7 @@
                     <pic:cNvPicPr/>
                   </pic:nvPicPr>
                   <pic:blipFill>
-                    <a:blip r:embed="rId24"/>
+                    <a:blip r:embed="rId25"/>
                     <a:stretch>
                       <a:fillRect/>
                     </a:stretch>
@@ -5092,6 +4553,48 @@
           <w:rFonts w:ascii="Times New Roman" w:hAnsi="Times New Roman" w:cs="Times New Roman"/>
         </w:rPr>
       </w:pPr>
+      <w:r>
+        <w:rPr>
+          <w:rFonts w:ascii="Times New Roman" w:hAnsi="Times New Roman" w:cs="Times New Roman"/>
+          <w:noProof/>
+        </w:rPr>
+        <w:lastRenderedPageBreak/>
+        <w:drawing>
+          <wp:inline distT="0" distB="0" distL="0" distR="0" wp14:anchorId="51B9DC07" wp14:editId="0FBC213C">
+            <wp:extent cx="5943600" cy="6010275"/>
+            <wp:effectExtent l="0" t="0" r="0" b="9525"/>
+            <wp:docPr id="430559022" name="Imagen 1"/>
+            <wp:cNvGraphicFramePr>
+              <a:graphicFrameLocks xmlns:a="http://schemas.openxmlformats.org/drawingml/2006/main" noChangeAspect="1"/>
+            </wp:cNvGraphicFramePr>
+            <a:graphic xmlns:a="http://schemas.openxmlformats.org/drawingml/2006/main">
+              <a:graphicData uri="http://schemas.openxmlformats.org/drawingml/2006/picture">
+                <pic:pic xmlns:pic="http://schemas.openxmlformats.org/drawingml/2006/picture">
+                  <pic:nvPicPr>
+                    <pic:cNvPr id="430559022" name=""/>
+                    <pic:cNvPicPr/>
+                  </pic:nvPicPr>
+                  <pic:blipFill>
+                    <a:blip r:embed="rId26"/>
+                    <a:stretch>
+                      <a:fillRect/>
+                    </a:stretch>
+                  </pic:blipFill>
+                  <pic:spPr>
+                    <a:xfrm>
+                      <a:off x="0" y="0"/>
+                      <a:ext cx="5943600" cy="6010275"/>
+                    </a:xfrm>
+                    <a:prstGeom prst="rect">
+                      <a:avLst/>
+                    </a:prstGeom>
+                  </pic:spPr>
+                </pic:pic>
+              </a:graphicData>
+            </a:graphic>
+          </wp:inline>
+        </w:drawing>
+      </w:r>
     </w:p>
     <w:p>
       <w:pPr>
@@ -5164,6 +4667,7 @@
           <w:b/>
           <w:bCs/>
         </w:rPr>
+        <w:lastRenderedPageBreak/>
         <w:t>Registro de Incidencias Técnicas y Soluciones de Reproducibilidad (LAB04)</w:t>
       </w:r>
     </w:p>
@@ -5182,36 +4686,8 @@
           <w:b/>
           <w:bCs/>
         </w:rPr>
-        <w:t xml:space="preserve">1. Error 404 en descarga HTTP directa desde </w:t>
+        <w:t>1. Error 404 en descarga HTTP directa desde Hugging Face</w:t>
       </w:r>
-      <w:proofErr w:type="spellStart"/>
-      <w:r>
-        <w:rPr>
-          <w:rFonts w:ascii="Times New Roman" w:hAnsi="Times New Roman" w:cs="Times New Roman"/>
-          <w:b/>
-          <w:bCs/>
-        </w:rPr>
-        <w:t>Hugging</w:t>
-      </w:r>
-      <w:proofErr w:type="spellEnd"/>
-      <w:r>
-        <w:rPr>
-          <w:rFonts w:ascii="Times New Roman" w:hAnsi="Times New Roman" w:cs="Times New Roman"/>
-          <w:b/>
-          <w:bCs/>
-        </w:rPr>
-        <w:t xml:space="preserve"> </w:t>
-      </w:r>
-      <w:proofErr w:type="spellStart"/>
-      <w:r>
-        <w:rPr>
-          <w:rFonts w:ascii="Times New Roman" w:hAnsi="Times New Roman" w:cs="Times New Roman"/>
-          <w:b/>
-          <w:bCs/>
-        </w:rPr>
-        <w:t>Face</w:t>
-      </w:r>
-      <w:proofErr w:type="spellEnd"/>
     </w:p>
     <w:p>
       <w:pPr>
@@ -5236,77 +4712,7 @@
         <w:rPr>
           <w:rFonts w:ascii="Times New Roman" w:hAnsi="Times New Roman" w:cs="Times New Roman"/>
         </w:rPr>
-        <w:t xml:space="preserve"> El intento de descarga mediante URL pública directa (</w:t>
-      </w:r>
-      <w:proofErr w:type="spellStart"/>
-      <w:r>
-        <w:rPr>
-          <w:rFonts w:ascii="Times New Roman" w:hAnsi="Times New Roman" w:cs="Times New Roman"/>
-        </w:rPr>
-        <w:t>requests.get</w:t>
-      </w:r>
-      <w:proofErr w:type="spellEnd"/>
-      <w:r>
-        <w:rPr>
-          <w:rFonts w:ascii="Times New Roman" w:hAnsi="Times New Roman" w:cs="Times New Roman"/>
-        </w:rPr>
-        <w:t xml:space="preserve">) a la ruta original de </w:t>
-      </w:r>
-      <w:proofErr w:type="spellStart"/>
-      <w:r>
-        <w:rPr>
-          <w:rFonts w:ascii="Times New Roman" w:hAnsi="Times New Roman" w:cs="Times New Roman"/>
-        </w:rPr>
-        <w:t>amazon_reviews_multi</w:t>
-      </w:r>
-      <w:proofErr w:type="spellEnd"/>
-      <w:r>
-        <w:rPr>
-          <w:rFonts w:ascii="Times New Roman" w:hAnsi="Times New Roman" w:cs="Times New Roman"/>
-        </w:rPr>
-        <w:t xml:space="preserve"> falló con un error HTTP 404 Client Error: Not Found. Esto se debió a la deprecación/reubicación interna de ciertos subconjuntos en </w:t>
-      </w:r>
-      <w:proofErr w:type="spellStart"/>
-      <w:r>
-        <w:rPr>
-          <w:rFonts w:ascii="Times New Roman" w:hAnsi="Times New Roman" w:cs="Times New Roman"/>
-        </w:rPr>
-        <w:t>Hugging</w:t>
-      </w:r>
-      <w:proofErr w:type="spellEnd"/>
-      <w:r>
-        <w:rPr>
-          <w:rFonts w:ascii="Times New Roman" w:hAnsi="Times New Roman" w:cs="Times New Roman"/>
-        </w:rPr>
-        <w:t xml:space="preserve"> </w:t>
-      </w:r>
-      <w:proofErr w:type="spellStart"/>
-      <w:r>
-        <w:rPr>
-          <w:rFonts w:ascii="Times New Roman" w:hAnsi="Times New Roman" w:cs="Times New Roman"/>
-        </w:rPr>
-        <w:t>Face</w:t>
-      </w:r>
-      <w:proofErr w:type="spellEnd"/>
-      <w:r>
-        <w:rPr>
-          <w:rFonts w:ascii="Times New Roman" w:hAnsi="Times New Roman" w:cs="Times New Roman"/>
-        </w:rPr>
-        <w:t xml:space="preserve"> y la migración masiva de </w:t>
-      </w:r>
-      <w:proofErr w:type="spellStart"/>
-      <w:r>
-        <w:rPr>
-          <w:rFonts w:ascii="Times New Roman" w:hAnsi="Times New Roman" w:cs="Times New Roman"/>
-        </w:rPr>
-        <w:t>datasets</w:t>
-      </w:r>
-      <w:proofErr w:type="spellEnd"/>
-      <w:r>
-        <w:rPr>
-          <w:rFonts w:ascii="Times New Roman" w:hAnsi="Times New Roman" w:cs="Times New Roman"/>
-        </w:rPr>
-        <w:t xml:space="preserve"> a formato Parquet.</w:t>
+        <w:t xml:space="preserve"> El intento de descarga mediante URL pública directa (requests.get) a la ruta original de amazon_reviews_multi falló con un error HTTP 404 Client Error: Not Found. Esto se debió a la deprecación/reubicación interna de ciertos subconjuntos en Hugging Face y la migración masiva de datasets a formato Parquet.</w:t>
       </w:r>
     </w:p>
     <w:p>
@@ -5332,21 +4738,7 @@
         <w:rPr>
           <w:rFonts w:ascii="Times New Roman" w:hAnsi="Times New Roman" w:cs="Times New Roman"/>
         </w:rPr>
-        <w:t xml:space="preserve"> Impedía que el script estándar scripts/download_data.py obtuviera el archivo .</w:t>
-      </w:r>
-      <w:proofErr w:type="spellStart"/>
-      <w:r>
-        <w:rPr>
-          <w:rFonts w:ascii="Times New Roman" w:hAnsi="Times New Roman" w:cs="Times New Roman"/>
-        </w:rPr>
-        <w:t>csv</w:t>
-      </w:r>
-      <w:proofErr w:type="spellEnd"/>
-      <w:r>
-        <w:rPr>
-          <w:rFonts w:ascii="Times New Roman" w:hAnsi="Times New Roman" w:cs="Times New Roman"/>
-        </w:rPr>
-        <w:t xml:space="preserve"> crudo vía HTTP directo. </w:t>
+        <w:t xml:space="preserve"> Impedía que el script estándar scripts/download_data.py obtuviera el archivo .csv crudo vía HTTP directo. </w:t>
       </w:r>
     </w:p>
     <w:p>
@@ -5386,65 +4778,8 @@
         <w:rPr>
           <w:rFonts w:ascii="Times New Roman" w:hAnsi="Times New Roman" w:cs="Times New Roman"/>
         </w:rPr>
-        <w:t xml:space="preserve"> (DATA_SOURCE=local en .</w:t>
+        <w:t xml:space="preserve"> (DATA_SOURCE=local en .env) y se utilizó la librería oficial de Python datasets de Hugging Face para descargar el </w:t>
       </w:r>
-      <w:proofErr w:type="spellStart"/>
-      <w:r>
-        <w:rPr>
-          <w:rFonts w:ascii="Times New Roman" w:hAnsi="Times New Roman" w:cs="Times New Roman"/>
-        </w:rPr>
-        <w:t>env</w:t>
-      </w:r>
-      <w:proofErr w:type="spellEnd"/>
-      <w:r>
-        <w:rPr>
-          <w:rFonts w:ascii="Times New Roman" w:hAnsi="Times New Roman" w:cs="Times New Roman"/>
-        </w:rPr>
-        <w:t xml:space="preserve">) y se utilizó la librería oficial de Python </w:t>
-      </w:r>
-      <w:proofErr w:type="spellStart"/>
-      <w:r>
-        <w:rPr>
-          <w:rFonts w:ascii="Times New Roman" w:hAnsi="Times New Roman" w:cs="Times New Roman"/>
-        </w:rPr>
-        <w:t>datasets</w:t>
-      </w:r>
-      <w:proofErr w:type="spellEnd"/>
-      <w:r>
-        <w:rPr>
-          <w:rFonts w:ascii="Times New Roman" w:hAnsi="Times New Roman" w:cs="Times New Roman"/>
-        </w:rPr>
-        <w:t xml:space="preserve"> de </w:t>
-      </w:r>
-      <w:proofErr w:type="spellStart"/>
-      <w:r>
-        <w:rPr>
-          <w:rFonts w:ascii="Times New Roman" w:hAnsi="Times New Roman" w:cs="Times New Roman"/>
-        </w:rPr>
-        <w:t>Hugging</w:t>
-      </w:r>
-      <w:proofErr w:type="spellEnd"/>
-      <w:r>
-        <w:rPr>
-          <w:rFonts w:ascii="Times New Roman" w:hAnsi="Times New Roman" w:cs="Times New Roman"/>
-        </w:rPr>
-        <w:t xml:space="preserve"> </w:t>
-      </w:r>
-      <w:proofErr w:type="spellStart"/>
-      <w:r>
-        <w:rPr>
-          <w:rFonts w:ascii="Times New Roman" w:hAnsi="Times New Roman" w:cs="Times New Roman"/>
-        </w:rPr>
-        <w:t>Face</w:t>
-      </w:r>
-      <w:proofErr w:type="spellEnd"/>
-      <w:r>
-        <w:rPr>
-          <w:rFonts w:ascii="Times New Roman" w:hAnsi="Times New Roman" w:cs="Times New Roman"/>
-        </w:rPr>
-        <w:t xml:space="preserve"> para descargar el </w:t>
-      </w:r>
-      <w:proofErr w:type="spellStart"/>
       <w:r>
         <w:rPr>
           <w:rFonts w:ascii="Times New Roman" w:hAnsi="Times New Roman" w:cs="Times New Roman"/>
@@ -5453,54 +4788,11 @@
         </w:rPr>
         <w:t>split</w:t>
       </w:r>
-      <w:proofErr w:type="spellEnd"/>
       <w:r>
         <w:rPr>
           <w:rFonts w:ascii="Times New Roman" w:hAnsi="Times New Roman" w:cs="Times New Roman"/>
         </w:rPr>
-        <w:t xml:space="preserve"> de entrenamiento (</w:t>
-      </w:r>
-      <w:proofErr w:type="spellStart"/>
-      <w:r>
-        <w:rPr>
-          <w:rFonts w:ascii="Times New Roman" w:hAnsi="Times New Roman" w:cs="Times New Roman"/>
-        </w:rPr>
-        <w:t>train</w:t>
-      </w:r>
-      <w:proofErr w:type="spellEnd"/>
-      <w:r>
-        <w:rPr>
-          <w:rFonts w:ascii="Times New Roman" w:hAnsi="Times New Roman" w:cs="Times New Roman"/>
-        </w:rPr>
-        <w:t xml:space="preserve">) de </w:t>
-      </w:r>
-      <w:proofErr w:type="spellStart"/>
-      <w:r>
-        <w:rPr>
-          <w:rFonts w:ascii="Times New Roman" w:hAnsi="Times New Roman" w:cs="Times New Roman"/>
-        </w:rPr>
-        <w:t>SetFit</w:t>
-      </w:r>
-      <w:proofErr w:type="spellEnd"/>
-      <w:r>
-        <w:rPr>
-          <w:rFonts w:ascii="Times New Roman" w:hAnsi="Times New Roman" w:cs="Times New Roman"/>
-        </w:rPr>
-        <w:t>/</w:t>
-      </w:r>
-      <w:proofErr w:type="spellStart"/>
-      <w:r>
-        <w:rPr>
-          <w:rFonts w:ascii="Times New Roman" w:hAnsi="Times New Roman" w:cs="Times New Roman"/>
-        </w:rPr>
-        <w:t>amazon_reviews_multi_es</w:t>
-      </w:r>
-      <w:proofErr w:type="spellEnd"/>
-      <w:r>
-        <w:rPr>
-          <w:rFonts w:ascii="Times New Roman" w:hAnsi="Times New Roman" w:cs="Times New Roman"/>
-        </w:rPr>
-        <w:t xml:space="preserve">, convirtiéndolo e independizándolo localmente en data/raw/dataset.csv. </w:t>
+        <w:t xml:space="preserve"> de entrenamiento (train) de SetFit/amazon_reviews_multi_es, convirtiéndolo e independizándolo localmente en data/raw/dataset.csv. </w:t>
       </w:r>
     </w:p>
     <w:p>
@@ -5518,43 +4810,7 @@
           <w:b/>
           <w:bCs/>
         </w:rPr>
-        <w:t>2. Inconsistencia de rutas en .</w:t>
-      </w:r>
-      <w:proofErr w:type="spellStart"/>
-      <w:r>
-        <w:rPr>
-          <w:rFonts w:ascii="Times New Roman" w:hAnsi="Times New Roman" w:cs="Times New Roman"/>
-          <w:b/>
-          <w:bCs/>
-        </w:rPr>
-        <w:t>env</w:t>
-      </w:r>
-      <w:proofErr w:type="spellEnd"/>
-      <w:r>
-        <w:rPr>
-          <w:rFonts w:ascii="Times New Roman" w:hAnsi="Times New Roman" w:cs="Times New Roman"/>
-          <w:b/>
-          <w:bCs/>
-        </w:rPr>
-        <w:t xml:space="preserve"> y </w:t>
-      </w:r>
-      <w:proofErr w:type="spellStart"/>
-      <w:r>
-        <w:rPr>
-          <w:rFonts w:ascii="Times New Roman" w:hAnsi="Times New Roman" w:cs="Times New Roman"/>
-          <w:b/>
-          <w:bCs/>
-        </w:rPr>
-        <w:t>fallback</w:t>
-      </w:r>
-      <w:proofErr w:type="spellEnd"/>
-      <w:r>
-        <w:rPr>
-          <w:rFonts w:ascii="Times New Roman" w:hAnsi="Times New Roman" w:cs="Times New Roman"/>
-          <w:b/>
-          <w:bCs/>
-        </w:rPr>
-        <w:t xml:space="preserve"> al dataset de prueba</w:t>
+        <w:t>2. Inconsistencia de rutas en .env y fallback al dataset de prueba</w:t>
       </w:r>
     </w:p>
     <w:p>
@@ -5580,21 +4836,7 @@
         <w:rPr>
           <w:rFonts w:ascii="Times New Roman" w:hAnsi="Times New Roman" w:cs="Times New Roman"/>
         </w:rPr>
-        <w:t xml:space="preserve"> En el archivo .</w:t>
-      </w:r>
-      <w:proofErr w:type="spellStart"/>
-      <w:r>
-        <w:rPr>
-          <w:rFonts w:ascii="Times New Roman" w:hAnsi="Times New Roman" w:cs="Times New Roman"/>
-        </w:rPr>
-        <w:t>env</w:t>
-      </w:r>
-      <w:proofErr w:type="spellEnd"/>
-      <w:r>
-        <w:rPr>
-          <w:rFonts w:ascii="Times New Roman" w:hAnsi="Times New Roman" w:cs="Times New Roman"/>
-        </w:rPr>
-        <w:t xml:space="preserve"> la variable DATASET_PATH apuntaba a data/raw/amazon_reviews_es.csv, mientras que el script download_data.py generaba por defecto el archivo en data/raw/dataset.csv.</w:t>
+        <w:t xml:space="preserve"> En el archivo .env la variable DATASET_PATH apuntaba a data/raw/amazon_reviews_es.csv, mientras que el script download_data.py generaba por defecto el archivo en data/raw/dataset.csv.</w:t>
       </w:r>
     </w:p>
     <w:p>
@@ -5620,35 +4862,7 @@
         <w:rPr>
           <w:rFonts w:ascii="Times New Roman" w:hAnsi="Times New Roman" w:cs="Times New Roman"/>
         </w:rPr>
-        <w:t xml:space="preserve"> Al no encontrar el archivo en la ruta declarada en </w:t>
-      </w:r>
-      <w:proofErr w:type="spellStart"/>
-      <w:r>
-        <w:rPr>
-          <w:rFonts w:ascii="Times New Roman" w:hAnsi="Times New Roman" w:cs="Times New Roman"/>
-        </w:rPr>
-        <w:t>el</w:t>
-      </w:r>
-      <w:proofErr w:type="spellEnd"/>
-      <w:r>
-        <w:rPr>
-          <w:rFonts w:ascii="Times New Roman" w:hAnsi="Times New Roman" w:cs="Times New Roman"/>
-        </w:rPr>
-        <w:t xml:space="preserve"> .</w:t>
-      </w:r>
-      <w:proofErr w:type="spellStart"/>
-      <w:r>
-        <w:rPr>
-          <w:rFonts w:ascii="Times New Roman" w:hAnsi="Times New Roman" w:cs="Times New Roman"/>
-        </w:rPr>
-        <w:t>env</w:t>
-      </w:r>
-      <w:proofErr w:type="spellEnd"/>
-      <w:r>
-        <w:rPr>
-          <w:rFonts w:ascii="Times New Roman" w:hAnsi="Times New Roman" w:cs="Times New Roman"/>
-        </w:rPr>
-        <w:t xml:space="preserve">, el script de auditoría (audit_data.py) recurría automáticamente al conjunto de demostración en data/sample/demo_text.csv (18 filas). </w:t>
+        <w:t xml:space="preserve"> Al no encontrar el archivo en la ruta declarada en el .env, el script de auditoría (audit_data.py) recurría automáticamente al conjunto de demostración en data/sample/demo_text.csv (18 filas). </w:t>
       </w:r>
     </w:p>
     <w:p>
@@ -5674,21 +4888,7 @@
         <w:rPr>
           <w:rFonts w:ascii="Times New Roman" w:hAnsi="Times New Roman" w:cs="Times New Roman"/>
         </w:rPr>
-        <w:t xml:space="preserve"> Se estandarizó la variable en .</w:t>
-      </w:r>
-      <w:proofErr w:type="spellStart"/>
-      <w:r>
-        <w:rPr>
-          <w:rFonts w:ascii="Times New Roman" w:hAnsi="Times New Roman" w:cs="Times New Roman"/>
-        </w:rPr>
-        <w:t>env</w:t>
-      </w:r>
-      <w:proofErr w:type="spellEnd"/>
-      <w:r>
-        <w:rPr>
-          <w:rFonts w:ascii="Times New Roman" w:hAnsi="Times New Roman" w:cs="Times New Roman"/>
-        </w:rPr>
-        <w:t xml:space="preserve"> especificando explícitamente DATASET_PATH=data/raw/dataset.csv, alineando la ruta configurada con el archivo real descargado. </w:t>
+        <w:t xml:space="preserve"> Se estandarizó la variable en .env especificando explícitamente DATASET_PATH=data/raw/dataset.csv, alineando la ruta configurada con el archivo real descargado. </w:t>
       </w:r>
     </w:p>
     <w:p>
@@ -5706,43 +4906,7 @@
           <w:b/>
           <w:bCs/>
         </w:rPr>
-        <w:t xml:space="preserve">3. Bloqueo de archivos en Windows / OneDrive (Access </w:t>
-      </w:r>
-      <w:proofErr w:type="spellStart"/>
-      <w:r>
-        <w:rPr>
-          <w:rFonts w:ascii="Times New Roman" w:hAnsi="Times New Roman" w:cs="Times New Roman"/>
-          <w:b/>
-          <w:bCs/>
-        </w:rPr>
-        <w:t>is</w:t>
-      </w:r>
-      <w:proofErr w:type="spellEnd"/>
-      <w:r>
-        <w:rPr>
-          <w:rFonts w:ascii="Times New Roman" w:hAnsi="Times New Roman" w:cs="Times New Roman"/>
-          <w:b/>
-          <w:bCs/>
-        </w:rPr>
-        <w:t xml:space="preserve"> </w:t>
-      </w:r>
-      <w:proofErr w:type="spellStart"/>
-      <w:r>
-        <w:rPr>
-          <w:rFonts w:ascii="Times New Roman" w:hAnsi="Times New Roman" w:cs="Times New Roman"/>
-          <w:b/>
-          <w:bCs/>
-        </w:rPr>
-        <w:t>denied</w:t>
-      </w:r>
-      <w:proofErr w:type="spellEnd"/>
-      <w:r>
-        <w:rPr>
-          <w:rFonts w:ascii="Times New Roman" w:hAnsi="Times New Roman" w:cs="Times New Roman"/>
-          <w:b/>
-          <w:bCs/>
-        </w:rPr>
-        <w:t xml:space="preserve"> - os error 5)</w:t>
+        <w:t>3. Bloqueo de archivos en Windows / OneDrive (Access is denied - os error 5)</w:t>
       </w:r>
     </w:p>
     <w:p>
@@ -5768,147 +4932,7 @@
         <w:rPr>
           <w:rFonts w:ascii="Times New Roman" w:hAnsi="Times New Roman" w:cs="Times New Roman"/>
         </w:rPr>
-        <w:t xml:space="preserve"> Al ejecutar comandos de gestión de dependencias como </w:t>
-      </w:r>
-      <w:proofErr w:type="spellStart"/>
-      <w:r>
-        <w:rPr>
-          <w:rFonts w:ascii="Times New Roman" w:hAnsi="Times New Roman" w:cs="Times New Roman"/>
-        </w:rPr>
-        <w:t>uv</w:t>
-      </w:r>
-      <w:proofErr w:type="spellEnd"/>
-      <w:r>
-        <w:rPr>
-          <w:rFonts w:ascii="Times New Roman" w:hAnsi="Times New Roman" w:cs="Times New Roman"/>
-        </w:rPr>
-        <w:t xml:space="preserve"> </w:t>
-      </w:r>
-      <w:proofErr w:type="spellStart"/>
-      <w:r>
-        <w:rPr>
-          <w:rFonts w:ascii="Times New Roman" w:hAnsi="Times New Roman" w:cs="Times New Roman"/>
-        </w:rPr>
-        <w:t>add</w:t>
-      </w:r>
-      <w:proofErr w:type="spellEnd"/>
-      <w:r>
-        <w:rPr>
-          <w:rFonts w:ascii="Times New Roman" w:hAnsi="Times New Roman" w:cs="Times New Roman"/>
-        </w:rPr>
-        <w:t xml:space="preserve"> </w:t>
-      </w:r>
-      <w:proofErr w:type="spellStart"/>
-      <w:r>
-        <w:rPr>
-          <w:rFonts w:ascii="Times New Roman" w:hAnsi="Times New Roman" w:cs="Times New Roman"/>
-        </w:rPr>
-        <w:t>datasets</w:t>
-      </w:r>
-      <w:proofErr w:type="spellEnd"/>
-      <w:r>
-        <w:rPr>
-          <w:rFonts w:ascii="Times New Roman" w:hAnsi="Times New Roman" w:cs="Times New Roman"/>
-        </w:rPr>
-        <w:t xml:space="preserve"> o </w:t>
-      </w:r>
-      <w:proofErr w:type="spellStart"/>
-      <w:r>
-        <w:rPr>
-          <w:rFonts w:ascii="Times New Roman" w:hAnsi="Times New Roman" w:cs="Times New Roman"/>
-        </w:rPr>
-        <w:t>uv</w:t>
-      </w:r>
-      <w:proofErr w:type="spellEnd"/>
-      <w:r>
-        <w:rPr>
-          <w:rFonts w:ascii="Times New Roman" w:hAnsi="Times New Roman" w:cs="Times New Roman"/>
-        </w:rPr>
-        <w:t xml:space="preserve"> </w:t>
-      </w:r>
-      <w:proofErr w:type="spellStart"/>
-      <w:r>
-        <w:rPr>
-          <w:rFonts w:ascii="Times New Roman" w:hAnsi="Times New Roman" w:cs="Times New Roman"/>
-        </w:rPr>
-        <w:t>sync</w:t>
-      </w:r>
-      <w:proofErr w:type="spellEnd"/>
-      <w:r>
-        <w:rPr>
-          <w:rFonts w:ascii="Times New Roman" w:hAnsi="Times New Roman" w:cs="Times New Roman"/>
-        </w:rPr>
-        <w:t xml:space="preserve">, se presentó el error Access </w:t>
-      </w:r>
-      <w:proofErr w:type="spellStart"/>
-      <w:r>
-        <w:rPr>
-          <w:rFonts w:ascii="Times New Roman" w:hAnsi="Times New Roman" w:cs="Times New Roman"/>
-        </w:rPr>
-        <w:t>is</w:t>
-      </w:r>
-      <w:proofErr w:type="spellEnd"/>
-      <w:r>
-        <w:rPr>
-          <w:rFonts w:ascii="Times New Roman" w:hAnsi="Times New Roman" w:cs="Times New Roman"/>
-        </w:rPr>
-        <w:t xml:space="preserve"> </w:t>
-      </w:r>
-      <w:proofErr w:type="spellStart"/>
-      <w:r>
-        <w:rPr>
-          <w:rFonts w:ascii="Times New Roman" w:hAnsi="Times New Roman" w:cs="Times New Roman"/>
-        </w:rPr>
-        <w:t>denied</w:t>
-      </w:r>
-      <w:proofErr w:type="spellEnd"/>
-      <w:r>
-        <w:rPr>
-          <w:rFonts w:ascii="Times New Roman" w:hAnsi="Times New Roman" w:cs="Times New Roman"/>
-        </w:rPr>
-        <w:t xml:space="preserve"> (os error 5) al intentar eliminar o reescribir la carpeta de metadatos .</w:t>
-      </w:r>
-      <w:proofErr w:type="spellStart"/>
-      <w:r>
-        <w:rPr>
-          <w:rFonts w:ascii="Times New Roman" w:hAnsi="Times New Roman" w:cs="Times New Roman"/>
-        </w:rPr>
-        <w:t>venv</w:t>
-      </w:r>
-      <w:proofErr w:type="spellEnd"/>
-      <w:r>
-        <w:rPr>
-          <w:rFonts w:ascii="Times New Roman" w:hAnsi="Times New Roman" w:cs="Times New Roman"/>
-        </w:rPr>
-        <w:t>\</w:t>
-      </w:r>
-      <w:proofErr w:type="spellStart"/>
-      <w:r>
-        <w:rPr>
-          <w:rFonts w:ascii="Times New Roman" w:hAnsi="Times New Roman" w:cs="Times New Roman"/>
-        </w:rPr>
-        <w:t>Lib</w:t>
-      </w:r>
-      <w:proofErr w:type="spellEnd"/>
-      <w:r>
-        <w:rPr>
-          <w:rFonts w:ascii="Times New Roman" w:hAnsi="Times New Roman" w:cs="Times New Roman"/>
-        </w:rPr>
-        <w:t>\site-</w:t>
-      </w:r>
-      <w:proofErr w:type="spellStart"/>
-      <w:r>
-        <w:rPr>
-          <w:rFonts w:ascii="Times New Roman" w:hAnsi="Times New Roman" w:cs="Times New Roman"/>
-        </w:rPr>
-        <w:t>packages</w:t>
-      </w:r>
-      <w:proofErr w:type="spellEnd"/>
-      <w:r>
-        <w:rPr>
-          <w:rFonts w:ascii="Times New Roman" w:hAnsi="Times New Roman" w:cs="Times New Roman"/>
-        </w:rPr>
-        <w:t>\inf8239_u02_nlp-0.1.0.dist-info.</w:t>
+        <w:t xml:space="preserve"> Al ejecutar comandos de gestión de dependencias como uv add datasets o uv sync, se presentó el error Access is denied (os error 5) al intentar eliminar o reescribir la carpeta de metadatos .venv\Lib\site-packages\inf8239_u02_nlp-0.1.0.dist-info.</w:t>
       </w:r>
     </w:p>
     <w:p>
@@ -5948,21 +4972,7 @@
         <w:rPr>
           <w:rFonts w:ascii="Times New Roman" w:hAnsi="Times New Roman" w:cs="Times New Roman"/>
         </w:rPr>
-        <w:t xml:space="preserve"> y por procesos de Python en segundo plano (como el servidor de lenguaje Pylance en VS Code) que mantenían bloqueados los archivos del entorno virtual .</w:t>
-      </w:r>
-      <w:proofErr w:type="spellStart"/>
-      <w:r>
-        <w:rPr>
-          <w:rFonts w:ascii="Times New Roman" w:hAnsi="Times New Roman" w:cs="Times New Roman"/>
-        </w:rPr>
-        <w:t>venv</w:t>
-      </w:r>
-      <w:proofErr w:type="spellEnd"/>
-      <w:r>
-        <w:rPr>
-          <w:rFonts w:ascii="Times New Roman" w:hAnsi="Times New Roman" w:cs="Times New Roman"/>
-        </w:rPr>
-        <w:t xml:space="preserve">. </w:t>
+        <w:t xml:space="preserve"> y por procesos de Python en segundo plano (como el servidor de lenguaje Pylance en VS Code) que mantenían bloqueados los archivos del entorno virtual .venv. </w:t>
       </w:r>
     </w:p>
     <w:p>
@@ -5982,7 +4992,6 @@
           <w:b/>
           <w:bCs/>
         </w:rPr>
-        <w:lastRenderedPageBreak/>
         <w:t>Solución:</w:t>
       </w:r>
     </w:p>
@@ -6001,21 +5010,7 @@
         <w:rPr>
           <w:rFonts w:ascii="Times New Roman" w:hAnsi="Times New Roman" w:cs="Times New Roman"/>
         </w:rPr>
-        <w:t>Se forzó la liberación de procesos en PowerShell mediante Stop-Process -Name "</w:t>
-      </w:r>
-      <w:proofErr w:type="spellStart"/>
-      <w:r>
-        <w:rPr>
-          <w:rFonts w:ascii="Times New Roman" w:hAnsi="Times New Roman" w:cs="Times New Roman"/>
-        </w:rPr>
-        <w:t>python</w:t>
-      </w:r>
-      <w:proofErr w:type="spellEnd"/>
-      <w:r>
-        <w:rPr>
-          <w:rFonts w:ascii="Times New Roman" w:hAnsi="Times New Roman" w:cs="Times New Roman"/>
-        </w:rPr>
-        <w:t>*" -Force.</w:t>
+        <w:t>Se forzó la liberación de procesos en PowerShell mediante Stop-Process -Name "python*" -Force.</w:t>
       </w:r>
     </w:p>
     <w:p>
@@ -6033,77 +5028,8 @@
         <w:rPr>
           <w:rFonts w:ascii="Times New Roman" w:hAnsi="Times New Roman" w:cs="Times New Roman"/>
         </w:rPr>
-        <w:t xml:space="preserve">Se instaló la dependencia usando la herramienta de administración directa de paquetes </w:t>
-      </w:r>
-      <w:proofErr w:type="spellStart"/>
-      <w:r>
-        <w:rPr>
-          <w:rFonts w:ascii="Times New Roman" w:hAnsi="Times New Roman" w:cs="Times New Roman"/>
-        </w:rPr>
-        <w:t>uv</w:t>
-      </w:r>
-      <w:proofErr w:type="spellEnd"/>
-      <w:r>
-        <w:rPr>
-          <w:rFonts w:ascii="Times New Roman" w:hAnsi="Times New Roman" w:cs="Times New Roman"/>
-        </w:rPr>
-        <w:t xml:space="preserve"> </w:t>
-      </w:r>
-      <w:proofErr w:type="spellStart"/>
-      <w:r>
-        <w:rPr>
-          <w:rFonts w:ascii="Times New Roman" w:hAnsi="Times New Roman" w:cs="Times New Roman"/>
-        </w:rPr>
-        <w:t>pip</w:t>
-      </w:r>
-      <w:proofErr w:type="spellEnd"/>
-      <w:r>
-        <w:rPr>
-          <w:rFonts w:ascii="Times New Roman" w:hAnsi="Times New Roman" w:cs="Times New Roman"/>
-        </w:rPr>
-        <w:t xml:space="preserve"> </w:t>
-      </w:r>
-      <w:proofErr w:type="spellStart"/>
-      <w:r>
-        <w:rPr>
-          <w:rFonts w:ascii="Times New Roman" w:hAnsi="Times New Roman" w:cs="Times New Roman"/>
-        </w:rPr>
-        <w:t>install</w:t>
-      </w:r>
-      <w:proofErr w:type="spellEnd"/>
-      <w:r>
-        <w:rPr>
-          <w:rFonts w:ascii="Times New Roman" w:hAnsi="Times New Roman" w:cs="Times New Roman"/>
-        </w:rPr>
-        <w:t xml:space="preserve"> </w:t>
-      </w:r>
-      <w:proofErr w:type="spellStart"/>
-      <w:r>
-        <w:rPr>
-          <w:rFonts w:ascii="Times New Roman" w:hAnsi="Times New Roman" w:cs="Times New Roman"/>
-        </w:rPr>
-        <w:t>datasets</w:t>
-      </w:r>
-      <w:proofErr w:type="spellEnd"/>
-      <w:r>
-        <w:rPr>
-          <w:rFonts w:ascii="Times New Roman" w:hAnsi="Times New Roman" w:cs="Times New Roman"/>
-        </w:rPr>
-        <w:t xml:space="preserve">, evitando que </w:t>
-      </w:r>
-      <w:proofErr w:type="spellStart"/>
-      <w:r>
-        <w:rPr>
-          <w:rFonts w:ascii="Times New Roman" w:hAnsi="Times New Roman" w:cs="Times New Roman"/>
-        </w:rPr>
-        <w:t>uv</w:t>
-      </w:r>
-      <w:proofErr w:type="spellEnd"/>
-      <w:r>
-        <w:rPr>
-          <w:rFonts w:ascii="Times New Roman" w:hAnsi="Times New Roman" w:cs="Times New Roman"/>
-        </w:rPr>
-        <w:t xml:space="preserve"> intentara desinstalar o reconstruir el paquete local en conflicto. </w:t>
+        <w:lastRenderedPageBreak/>
+        <w:t xml:space="preserve">Se instaló la dependencia usando la herramienta de administración directa de paquetes uv pip install datasets, evitando que uv intentara desinstalar o reconstruir el paquete local en conflicto. </w:t>
       </w:r>
     </w:p>
     <w:p>
@@ -6121,49 +5047,7 @@
         <w:rPr>
           <w:rFonts w:ascii="Times New Roman" w:hAnsi="Times New Roman" w:cs="Times New Roman"/>
         </w:rPr>
-        <w:t xml:space="preserve">Como alternativa de ejecución aislada sin modificar el entorno cargado, se validó el uso de inyección dinámica de dependencias mediante </w:t>
-      </w:r>
-      <w:proofErr w:type="spellStart"/>
-      <w:r>
-        <w:rPr>
-          <w:rFonts w:ascii="Times New Roman" w:hAnsi="Times New Roman" w:cs="Times New Roman"/>
-        </w:rPr>
-        <w:t>uv</w:t>
-      </w:r>
-      <w:proofErr w:type="spellEnd"/>
-      <w:r>
-        <w:rPr>
-          <w:rFonts w:ascii="Times New Roman" w:hAnsi="Times New Roman" w:cs="Times New Roman"/>
-        </w:rPr>
-        <w:t xml:space="preserve"> run --</w:t>
-      </w:r>
-      <w:proofErr w:type="spellStart"/>
-      <w:r>
-        <w:rPr>
-          <w:rFonts w:ascii="Times New Roman" w:hAnsi="Times New Roman" w:cs="Times New Roman"/>
-        </w:rPr>
-        <w:t>with</w:t>
-      </w:r>
-      <w:proofErr w:type="spellEnd"/>
-      <w:r>
-        <w:rPr>
-          <w:rFonts w:ascii="Times New Roman" w:hAnsi="Times New Roman" w:cs="Times New Roman"/>
-        </w:rPr>
-        <w:t xml:space="preserve"> </w:t>
-      </w:r>
-      <w:proofErr w:type="spellStart"/>
-      <w:r>
-        <w:rPr>
-          <w:rFonts w:ascii="Times New Roman" w:hAnsi="Times New Roman" w:cs="Times New Roman"/>
-        </w:rPr>
-        <w:t>datasets</w:t>
-      </w:r>
-      <w:proofErr w:type="spellEnd"/>
-      <w:r>
-        <w:rPr>
-          <w:rFonts w:ascii="Times New Roman" w:hAnsi="Times New Roman" w:cs="Times New Roman"/>
-        </w:rPr>
-        <w:t xml:space="preserve"> .... </w:t>
+        <w:t xml:space="preserve">Como alternativa de ejecución aislada sin modificar el entorno cargado, se validó el uso de inyección dinámica de dependencias mediante uv run --with datasets .... </w:t>
       </w:r>
     </w:p>
     <w:p>
@@ -6181,97 +5065,7 @@
           <w:b/>
           <w:bCs/>
         </w:rPr>
-        <w:t xml:space="preserve">4. Ausencia del módulo </w:t>
-      </w:r>
-      <w:proofErr w:type="spellStart"/>
-      <w:r>
-        <w:rPr>
-          <w:rFonts w:ascii="Times New Roman" w:hAnsi="Times New Roman" w:cs="Times New Roman"/>
-          <w:b/>
-          <w:bCs/>
-        </w:rPr>
-        <w:t>pip</w:t>
-      </w:r>
-      <w:proofErr w:type="spellEnd"/>
-      <w:r>
-        <w:rPr>
-          <w:rFonts w:ascii="Times New Roman" w:hAnsi="Times New Roman" w:cs="Times New Roman"/>
-          <w:b/>
-          <w:bCs/>
-        </w:rPr>
-        <w:t xml:space="preserve"> en entornos ligeros de </w:t>
-      </w:r>
-      <w:proofErr w:type="spellStart"/>
-      <w:r>
-        <w:rPr>
-          <w:rFonts w:ascii="Times New Roman" w:hAnsi="Times New Roman" w:cs="Times New Roman"/>
-          <w:b/>
-          <w:bCs/>
-        </w:rPr>
-        <w:t>uv</w:t>
-      </w:r>
-      <w:proofErr w:type="spellEnd"/>
-      <w:r>
-        <w:rPr>
-          <w:rFonts w:ascii="Times New Roman" w:hAnsi="Times New Roman" w:cs="Times New Roman"/>
-          <w:b/>
-          <w:bCs/>
-        </w:rPr>
-        <w:t xml:space="preserve"> (</w:t>
-      </w:r>
-      <w:proofErr w:type="spellStart"/>
-      <w:r>
-        <w:rPr>
-          <w:rFonts w:ascii="Times New Roman" w:hAnsi="Times New Roman" w:cs="Times New Roman"/>
-          <w:b/>
-          <w:bCs/>
-        </w:rPr>
-        <w:t>ModuleNotFoundError</w:t>
-      </w:r>
-      <w:proofErr w:type="spellEnd"/>
-      <w:r>
-        <w:rPr>
-          <w:rFonts w:ascii="Times New Roman" w:hAnsi="Times New Roman" w:cs="Times New Roman"/>
-          <w:b/>
-          <w:bCs/>
-        </w:rPr>
-        <w:t xml:space="preserve">: No module </w:t>
-      </w:r>
-      <w:proofErr w:type="spellStart"/>
-      <w:r>
-        <w:rPr>
-          <w:rFonts w:ascii="Times New Roman" w:hAnsi="Times New Roman" w:cs="Times New Roman"/>
-          <w:b/>
-          <w:bCs/>
-        </w:rPr>
-        <w:t>named</w:t>
-      </w:r>
-      <w:proofErr w:type="spellEnd"/>
-      <w:r>
-        <w:rPr>
-          <w:rFonts w:ascii="Times New Roman" w:hAnsi="Times New Roman" w:cs="Times New Roman"/>
-          <w:b/>
-          <w:bCs/>
-        </w:rPr>
-        <w:t xml:space="preserve"> </w:t>
-      </w:r>
-      <w:proofErr w:type="spellStart"/>
-      <w:r>
-        <w:rPr>
-          <w:rFonts w:ascii="Times New Roman" w:hAnsi="Times New Roman" w:cs="Times New Roman"/>
-          <w:b/>
-          <w:bCs/>
-        </w:rPr>
-        <w:t>pip</w:t>
-      </w:r>
-      <w:proofErr w:type="spellEnd"/>
-      <w:r>
-        <w:rPr>
-          <w:rFonts w:ascii="Times New Roman" w:hAnsi="Times New Roman" w:cs="Times New Roman"/>
-          <w:b/>
-          <w:bCs/>
-        </w:rPr>
-        <w:t>)</w:t>
+        <w:t>4. Ausencia del módulo pip en entornos ligeros de uv (ModuleNotFoundError: No module named pip)</w:t>
       </w:r>
     </w:p>
     <w:p>
@@ -6297,91 +5091,7 @@
         <w:rPr>
           <w:rFonts w:ascii="Times New Roman" w:hAnsi="Times New Roman" w:cs="Times New Roman"/>
         </w:rPr>
-        <w:t xml:space="preserve"> Al intentar ejecutar </w:t>
-      </w:r>
-      <w:proofErr w:type="spellStart"/>
-      <w:r>
-        <w:rPr>
-          <w:rFonts w:ascii="Times New Roman" w:hAnsi="Times New Roman" w:cs="Times New Roman"/>
-        </w:rPr>
-        <w:t>python</w:t>
-      </w:r>
-      <w:proofErr w:type="spellEnd"/>
-      <w:r>
-        <w:rPr>
-          <w:rFonts w:ascii="Times New Roman" w:hAnsi="Times New Roman" w:cs="Times New Roman"/>
-        </w:rPr>
-        <w:t xml:space="preserve"> -m </w:t>
-      </w:r>
-      <w:proofErr w:type="spellStart"/>
-      <w:r>
-        <w:rPr>
-          <w:rFonts w:ascii="Times New Roman" w:hAnsi="Times New Roman" w:cs="Times New Roman"/>
-        </w:rPr>
-        <w:t>pip</w:t>
-      </w:r>
-      <w:proofErr w:type="spellEnd"/>
-      <w:r>
-        <w:rPr>
-          <w:rFonts w:ascii="Times New Roman" w:hAnsi="Times New Roman" w:cs="Times New Roman"/>
-        </w:rPr>
-        <w:t xml:space="preserve"> </w:t>
-      </w:r>
-      <w:proofErr w:type="spellStart"/>
-      <w:r>
-        <w:rPr>
-          <w:rFonts w:ascii="Times New Roman" w:hAnsi="Times New Roman" w:cs="Times New Roman"/>
-        </w:rPr>
-        <w:t>install</w:t>
-      </w:r>
-      <w:proofErr w:type="spellEnd"/>
-      <w:r>
-        <w:rPr>
-          <w:rFonts w:ascii="Times New Roman" w:hAnsi="Times New Roman" w:cs="Times New Roman"/>
-        </w:rPr>
-        <w:t xml:space="preserve"> </w:t>
-      </w:r>
-      <w:proofErr w:type="spellStart"/>
-      <w:r>
-        <w:rPr>
-          <w:rFonts w:ascii="Times New Roman" w:hAnsi="Times New Roman" w:cs="Times New Roman"/>
-        </w:rPr>
-        <w:t>datasets</w:t>
-      </w:r>
-      <w:proofErr w:type="spellEnd"/>
-      <w:r>
-        <w:rPr>
-          <w:rFonts w:ascii="Times New Roman" w:hAnsi="Times New Roman" w:cs="Times New Roman"/>
-        </w:rPr>
-        <w:t xml:space="preserve">, el intérprete devolvió No module </w:t>
-      </w:r>
-      <w:proofErr w:type="spellStart"/>
-      <w:r>
-        <w:rPr>
-          <w:rFonts w:ascii="Times New Roman" w:hAnsi="Times New Roman" w:cs="Times New Roman"/>
-        </w:rPr>
-        <w:t>named</w:t>
-      </w:r>
-      <w:proofErr w:type="spellEnd"/>
-      <w:r>
-        <w:rPr>
-          <w:rFonts w:ascii="Times New Roman" w:hAnsi="Times New Roman" w:cs="Times New Roman"/>
-        </w:rPr>
-        <w:t xml:space="preserve"> </w:t>
-      </w:r>
-      <w:proofErr w:type="spellStart"/>
-      <w:r>
-        <w:rPr>
-          <w:rFonts w:ascii="Times New Roman" w:hAnsi="Times New Roman" w:cs="Times New Roman"/>
-        </w:rPr>
-        <w:t>pip</w:t>
-      </w:r>
-      <w:proofErr w:type="spellEnd"/>
-      <w:r>
-        <w:rPr>
-          <w:rFonts w:ascii="Times New Roman" w:hAnsi="Times New Roman" w:cs="Times New Roman"/>
-        </w:rPr>
-        <w:t>.</w:t>
+        <w:t xml:space="preserve"> Al intentar ejecutar python -m pip install datasets, el intérprete devolvió No module named pip.</w:t>
       </w:r>
     </w:p>
     <w:p>
@@ -6407,49 +5117,7 @@
         <w:rPr>
           <w:rFonts w:ascii="Times New Roman" w:hAnsi="Times New Roman" w:cs="Times New Roman"/>
         </w:rPr>
-        <w:t xml:space="preserve"> Los entornos virtuales gestionados por </w:t>
-      </w:r>
-      <w:proofErr w:type="spellStart"/>
-      <w:r>
-        <w:rPr>
-          <w:rFonts w:ascii="Times New Roman" w:hAnsi="Times New Roman" w:cs="Times New Roman"/>
-        </w:rPr>
-        <w:t>uv</w:t>
-      </w:r>
-      <w:proofErr w:type="spellEnd"/>
-      <w:r>
-        <w:rPr>
-          <w:rFonts w:ascii="Times New Roman" w:hAnsi="Times New Roman" w:cs="Times New Roman"/>
-        </w:rPr>
-        <w:t xml:space="preserve"> se crean de forma optimizada y minimalista, omitiendo la instalación por defecto de </w:t>
-      </w:r>
-      <w:proofErr w:type="spellStart"/>
-      <w:r>
-        <w:rPr>
-          <w:rFonts w:ascii="Times New Roman" w:hAnsi="Times New Roman" w:cs="Times New Roman"/>
-        </w:rPr>
-        <w:t>pip</w:t>
-      </w:r>
-      <w:proofErr w:type="spellEnd"/>
-      <w:r>
-        <w:rPr>
-          <w:rFonts w:ascii="Times New Roman" w:hAnsi="Times New Roman" w:cs="Times New Roman"/>
-        </w:rPr>
-        <w:t xml:space="preserve"> dentro de .</w:t>
-      </w:r>
-      <w:proofErr w:type="spellStart"/>
-      <w:r>
-        <w:rPr>
-          <w:rFonts w:ascii="Times New Roman" w:hAnsi="Times New Roman" w:cs="Times New Roman"/>
-        </w:rPr>
-        <w:t>venv</w:t>
-      </w:r>
-      <w:proofErr w:type="spellEnd"/>
-      <w:r>
-        <w:rPr>
-          <w:rFonts w:ascii="Times New Roman" w:hAnsi="Times New Roman" w:cs="Times New Roman"/>
-        </w:rPr>
-        <w:t xml:space="preserve">. </w:t>
+        <w:t xml:space="preserve"> Los entornos virtuales gestionados por uv se crean de forma optimizada y minimalista, omitiendo la instalación por defecto de pip dentro de .venv. </w:t>
       </w:r>
     </w:p>
     <w:p>
@@ -6475,77 +5143,7 @@
         <w:rPr>
           <w:rFonts w:ascii="Times New Roman" w:hAnsi="Times New Roman" w:cs="Times New Roman"/>
         </w:rPr>
-        <w:t xml:space="preserve"> Se utilizó el gestor de paquetes integrado de </w:t>
-      </w:r>
-      <w:proofErr w:type="spellStart"/>
-      <w:r>
-        <w:rPr>
-          <w:rFonts w:ascii="Times New Roman" w:hAnsi="Times New Roman" w:cs="Times New Roman"/>
-        </w:rPr>
-        <w:t>uv</w:t>
-      </w:r>
-      <w:proofErr w:type="spellEnd"/>
-      <w:r>
-        <w:rPr>
-          <w:rFonts w:ascii="Times New Roman" w:hAnsi="Times New Roman" w:cs="Times New Roman"/>
-        </w:rPr>
-        <w:t xml:space="preserve"> ejecutando el comando </w:t>
-      </w:r>
-      <w:proofErr w:type="spellStart"/>
-      <w:r>
-        <w:rPr>
-          <w:rFonts w:ascii="Times New Roman" w:hAnsi="Times New Roman" w:cs="Times New Roman"/>
-        </w:rPr>
-        <w:t>uv</w:t>
-      </w:r>
-      <w:proofErr w:type="spellEnd"/>
-      <w:r>
-        <w:rPr>
-          <w:rFonts w:ascii="Times New Roman" w:hAnsi="Times New Roman" w:cs="Times New Roman"/>
-        </w:rPr>
-        <w:t xml:space="preserve"> </w:t>
-      </w:r>
-      <w:proofErr w:type="spellStart"/>
-      <w:r>
-        <w:rPr>
-          <w:rFonts w:ascii="Times New Roman" w:hAnsi="Times New Roman" w:cs="Times New Roman"/>
-        </w:rPr>
-        <w:t>pip</w:t>
-      </w:r>
-      <w:proofErr w:type="spellEnd"/>
-      <w:r>
-        <w:rPr>
-          <w:rFonts w:ascii="Times New Roman" w:hAnsi="Times New Roman" w:cs="Times New Roman"/>
-        </w:rPr>
-        <w:t xml:space="preserve"> </w:t>
-      </w:r>
-      <w:proofErr w:type="spellStart"/>
-      <w:r>
-        <w:rPr>
-          <w:rFonts w:ascii="Times New Roman" w:hAnsi="Times New Roman" w:cs="Times New Roman"/>
-        </w:rPr>
-        <w:t>install</w:t>
-      </w:r>
-      <w:proofErr w:type="spellEnd"/>
-      <w:r>
-        <w:rPr>
-          <w:rFonts w:ascii="Times New Roman" w:hAnsi="Times New Roman" w:cs="Times New Roman"/>
-        </w:rPr>
-        <w:t xml:space="preserve"> </w:t>
-      </w:r>
-      <w:proofErr w:type="spellStart"/>
-      <w:r>
-        <w:rPr>
-          <w:rFonts w:ascii="Times New Roman" w:hAnsi="Times New Roman" w:cs="Times New Roman"/>
-        </w:rPr>
-        <w:t>datasets</w:t>
-      </w:r>
-      <w:proofErr w:type="spellEnd"/>
-      <w:r>
-        <w:rPr>
-          <w:rFonts w:ascii="Times New Roman" w:hAnsi="Times New Roman" w:cs="Times New Roman"/>
-        </w:rPr>
-        <w:t xml:space="preserve">, permitiendo la instalación en la carpeta del entorno virtual. </w:t>
+        <w:t xml:space="preserve"> Se utilizó el gestor de paquetes integrado de uv ejecutando el comando uv pip install datasets, permitiendo la instalación en la carpeta del entorno virtual. </w:t>
       </w:r>
     </w:p>
     <w:p>
@@ -6563,61 +5161,7 @@
           <w:b/>
           <w:bCs/>
         </w:rPr>
-        <w:t xml:space="preserve">5. Advertencia de </w:t>
-      </w:r>
-      <w:proofErr w:type="spellStart"/>
-      <w:r>
-        <w:rPr>
-          <w:rFonts w:ascii="Times New Roman" w:hAnsi="Times New Roman" w:cs="Times New Roman"/>
-          <w:b/>
-          <w:bCs/>
-        </w:rPr>
-        <w:t>symlinks</w:t>
-      </w:r>
-      <w:proofErr w:type="spellEnd"/>
-      <w:r>
-        <w:rPr>
-          <w:rFonts w:ascii="Times New Roman" w:hAnsi="Times New Roman" w:cs="Times New Roman"/>
-          <w:b/>
-          <w:bCs/>
-        </w:rPr>
-        <w:t xml:space="preserve"> en el caché de </w:t>
-      </w:r>
-      <w:proofErr w:type="spellStart"/>
-      <w:r>
-        <w:rPr>
-          <w:rFonts w:ascii="Times New Roman" w:hAnsi="Times New Roman" w:cs="Times New Roman"/>
-          <w:b/>
-          <w:bCs/>
-        </w:rPr>
-        <w:t>Hugging</w:t>
-      </w:r>
-      <w:proofErr w:type="spellEnd"/>
-      <w:r>
-        <w:rPr>
-          <w:rFonts w:ascii="Times New Roman" w:hAnsi="Times New Roman" w:cs="Times New Roman"/>
-          <w:b/>
-          <w:bCs/>
-        </w:rPr>
-        <w:t xml:space="preserve"> </w:t>
-      </w:r>
-      <w:proofErr w:type="spellStart"/>
-      <w:r>
-        <w:rPr>
-          <w:rFonts w:ascii="Times New Roman" w:hAnsi="Times New Roman" w:cs="Times New Roman"/>
-          <w:b/>
-          <w:bCs/>
-        </w:rPr>
-        <w:t>Face</w:t>
-      </w:r>
-      <w:proofErr w:type="spellEnd"/>
-      <w:r>
-        <w:rPr>
-          <w:rFonts w:ascii="Times New Roman" w:hAnsi="Times New Roman" w:cs="Times New Roman"/>
-          <w:b/>
-          <w:bCs/>
-        </w:rPr>
-        <w:t xml:space="preserve"> (Windows)</w:t>
+        <w:t>5. Advertencia de symlinks en el caché de Hugging Face (Windows)</w:t>
       </w:r>
     </w:p>
     <w:p>
@@ -6643,37 +5187,8 @@
         <w:rPr>
           <w:rFonts w:ascii="Times New Roman" w:hAnsi="Times New Roman" w:cs="Times New Roman"/>
         </w:rPr>
-        <w:t xml:space="preserve"> Durante la descarga del corpus, la librería </w:t>
+        <w:t xml:space="preserve"> Durante la descarga del corpus, la librería huggingface_hub emitió una advertencia (UserWarning) indicando que el sistema de archivos de Windows no tenía activado el soporte de enlaces simbólicos (</w:t>
       </w:r>
-      <w:proofErr w:type="spellStart"/>
-      <w:r>
-        <w:rPr>
-          <w:rFonts w:ascii="Times New Roman" w:hAnsi="Times New Roman" w:cs="Times New Roman"/>
-        </w:rPr>
-        <w:t>huggingface_hub</w:t>
-      </w:r>
-      <w:proofErr w:type="spellEnd"/>
-      <w:r>
-        <w:rPr>
-          <w:rFonts w:ascii="Times New Roman" w:hAnsi="Times New Roman" w:cs="Times New Roman"/>
-        </w:rPr>
-        <w:t xml:space="preserve"> emitió una advertencia (</w:t>
-      </w:r>
-      <w:proofErr w:type="spellStart"/>
-      <w:r>
-        <w:rPr>
-          <w:rFonts w:ascii="Times New Roman" w:hAnsi="Times New Roman" w:cs="Times New Roman"/>
-        </w:rPr>
-        <w:t>UserWarning</w:t>
-      </w:r>
-      <w:proofErr w:type="spellEnd"/>
-      <w:r>
-        <w:rPr>
-          <w:rFonts w:ascii="Times New Roman" w:hAnsi="Times New Roman" w:cs="Times New Roman"/>
-        </w:rPr>
-        <w:t>) indicando que el sistema de archivos de Windows no tenía activado el soporte de enlaces simbólicos (</w:t>
-      </w:r>
-      <w:proofErr w:type="spellStart"/>
       <w:r>
         <w:rPr>
           <w:rFonts w:ascii="Times New Roman" w:hAnsi="Times New Roman" w:cs="Times New Roman"/>
@@ -6682,7 +5197,6 @@
         </w:rPr>
         <w:t>symlinks</w:t>
       </w:r>
-      <w:proofErr w:type="spellEnd"/>
       <w:r>
         <w:rPr>
           <w:rFonts w:ascii="Times New Roman" w:hAnsi="Times New Roman" w:cs="Times New Roman"/>
@@ -6713,35 +5227,7 @@
         <w:rPr>
           <w:rFonts w:ascii="Times New Roman" w:hAnsi="Times New Roman" w:cs="Times New Roman"/>
         </w:rPr>
-        <w:t xml:space="preserve"> La descarga continuó correctamente almacenando los datos mediante copia completa en la memoria caché (.cache/</w:t>
-      </w:r>
-      <w:proofErr w:type="spellStart"/>
-      <w:r>
-        <w:rPr>
-          <w:rFonts w:ascii="Times New Roman" w:hAnsi="Times New Roman" w:cs="Times New Roman"/>
-        </w:rPr>
-        <w:t>huggingface</w:t>
-      </w:r>
-      <w:proofErr w:type="spellEnd"/>
-      <w:r>
-        <w:rPr>
-          <w:rFonts w:ascii="Times New Roman" w:hAnsi="Times New Roman" w:cs="Times New Roman"/>
-        </w:rPr>
-        <w:t>/</w:t>
-      </w:r>
-      <w:proofErr w:type="spellStart"/>
-      <w:r>
-        <w:rPr>
-          <w:rFonts w:ascii="Times New Roman" w:hAnsi="Times New Roman" w:cs="Times New Roman"/>
-        </w:rPr>
-        <w:t>hub</w:t>
-      </w:r>
-      <w:proofErr w:type="spellEnd"/>
-      <w:r>
-        <w:rPr>
-          <w:rFonts w:ascii="Times New Roman" w:hAnsi="Times New Roman" w:cs="Times New Roman"/>
-        </w:rPr>
-        <w:t xml:space="preserve">), lo cual no compromete la integridad del archivo exportado a data/raw/dataset.csv. </w:t>
+        <w:t xml:space="preserve"> La descarga continuó correctamente almacenando los datos mediante copia completa en la memoria caché (.cache/huggingface/hub), lo cual no compromete la integridad del archivo exportado a data/raw/dataset.csv. </w:t>
       </w:r>
     </w:p>
     <w:p>
@@ -6757,13 +5243,103 @@
         <w:jc w:val="both"/>
         <w:rPr>
           <w:rFonts w:ascii="Times New Roman" w:hAnsi="Times New Roman" w:cs="Times New Roman"/>
+          <w:b/>
+          <w:bCs/>
         </w:rPr>
       </w:pPr>
       <w:r>
         <w:rPr>
           <w:rFonts w:ascii="Times New Roman" w:hAnsi="Times New Roman" w:cs="Times New Roman"/>
-        </w:rPr>
-        <w:lastRenderedPageBreak/>
+          <w:b/>
+          <w:bCs/>
+        </w:rPr>
+        <w:t>Declaración de uso de Inteligencia Artificial</w:t>
+      </w:r>
+    </w:p>
+    <w:p>
+      <w:pPr>
+        <w:jc w:val="both"/>
+        <w:rPr>
+          <w:rFonts w:ascii="Times New Roman" w:hAnsi="Times New Roman" w:cs="Times New Roman"/>
+        </w:rPr>
+      </w:pPr>
+      <w:r>
+        <w:rPr>
+          <w:rFonts w:ascii="Times New Roman" w:hAnsi="Times New Roman" w:cs="Times New Roman"/>
+        </w:rPr>
+        <w:t xml:space="preserve">Durante el desarrollo de este proyecto analítico y la redacción del reporte técnico correspondiente al laboratorio </w:t>
+      </w:r>
+      <w:r>
+        <w:rPr>
+          <w:rFonts w:ascii="Times New Roman" w:hAnsi="Times New Roman" w:cs="Times New Roman"/>
+          <w:b/>
+          <w:bCs/>
+        </w:rPr>
+        <w:t>U02.LAB04: Desde cero: localizar, aprobar y auditar un corpus público</w:t>
+      </w:r>
+      <w:r>
+        <w:rPr>
+          <w:rFonts w:ascii="Times New Roman" w:hAnsi="Times New Roman" w:cs="Times New Roman"/>
+        </w:rPr>
+        <w:t>, se utilizó una herramienta de asistencia basada en Inteligencia Artificial como recurso de apoyo consultivo. Su uso se limitó a la clarificación de conceptos sobre reproducibilidad y auditoría de datos de PLN, orientación en la estructuración de la Ficha Técnica (</w:t>
+      </w:r>
+      <w:r>
+        <w:rPr>
+          <w:rFonts w:ascii="Times New Roman" w:hAnsi="Times New Roman" w:cs="Times New Roman"/>
+          <w:i/>
+          <w:iCs/>
+        </w:rPr>
+        <w:t>Dataset Card</w:t>
+      </w:r>
+      <w:r>
+        <w:rPr>
+          <w:rFonts w:ascii="Times New Roman" w:hAnsi="Times New Roman" w:cs="Times New Roman"/>
+        </w:rPr>
+        <w:t xml:space="preserve">) y el diccionario de variables, apoyo en la configuración de entornos aislados con uv y control de versiones con Git, así como en la revisión formal del informe. </w:t>
+      </w:r>
+    </w:p>
+    <w:p>
+      <w:pPr>
+        <w:jc w:val="both"/>
+        <w:rPr>
+          <w:rFonts w:ascii="Times New Roman" w:hAnsi="Times New Roman" w:cs="Times New Roman"/>
+        </w:rPr>
+      </w:pPr>
+      <w:r>
+        <w:rPr>
+          <w:rFonts w:ascii="Times New Roman" w:hAnsi="Times New Roman" w:cs="Times New Roman"/>
+        </w:rPr>
+        <w:t>El autor ha ejecutado, verificado y validado de forma autónoma la totalidad de la descarga e independización local del dataset, el cálculo del Hash SHA-256, los análisis estadísticos de auditoría de datos, la aprobación de las pruebas de contrato con pytest y las conclusiones metodológicas expuestas, asumiendo la plena y exclusiva responsabilidad sobre el contenido final del entregable.</w:t>
+      </w:r>
+    </w:p>
+    <w:p>
+      <w:pPr>
+        <w:jc w:val="both"/>
+        <w:rPr>
+          <w:rFonts w:ascii="Times New Roman" w:hAnsi="Times New Roman" w:cs="Times New Roman"/>
+        </w:rPr>
+      </w:pPr>
+    </w:p>
+    <w:p>
+      <w:pPr>
+        <w:jc w:val="both"/>
+        <w:rPr>
+          <w:rFonts w:ascii="Times New Roman" w:hAnsi="Times New Roman" w:cs="Times New Roman"/>
+        </w:rPr>
+      </w:pPr>
+    </w:p>
+    <w:p>
+      <w:pPr>
+        <w:jc w:val="both"/>
+        <w:rPr>
+          <w:rFonts w:ascii="Times New Roman" w:hAnsi="Times New Roman" w:cs="Times New Roman"/>
+        </w:rPr>
+      </w:pPr>
+      <w:r>
+        <w:rPr>
+          <w:rFonts w:ascii="Times New Roman" w:hAnsi="Times New Roman" w:cs="Times New Roman"/>
+          <w:noProof/>
+        </w:rPr>
         <w:drawing>
           <wp:inline distT="0" distB="0" distL="0" distR="0" wp14:anchorId="6835477B" wp14:editId="00A1626E">
             <wp:extent cx="5943600" cy="5906770"/>
@@ -6780,7 +5356,7 @@
                     <pic:cNvPicPr/>
                   </pic:nvPicPr>
                   <pic:blipFill>
-                    <a:blip r:embed="rId21"/>
+                    <a:blip r:embed="rId22"/>
                     <a:stretch>
                       <a:fillRect/>
                     </a:stretch>
@@ -6802,7 +5378,7 @@
       </w:r>
     </w:p>
     <w:sectPr>
-      <w:headerReference w:type="first" r:id="rId25"/>
+      <w:headerReference w:type="first" r:id="rId27"/>
       <w:pgSz w:w="12240" w:h="15840" w:code="1"/>
       <w:pgMar w:top="1440" w:right="1440" w:bottom="1440" w:left="1440" w:header="709" w:footer="709" w:gutter="0"/>
       <w:pgNumType w:start="0"/>
@@ -9631,6 +8207,7 @@
   <w:style w:type="character" w:default="1" w:styleId="Fuentedeprrafopredeter">
     <w:name w:val="Default Paragraph Font"/>
     <w:uiPriority w:val="1"/>
+    <w:semiHidden/>
     <w:unhideWhenUsed/>
   </w:style>
   <w:style w:type="table" w:default="1" w:styleId="Tablanormal">
@@ -10348,8 +8925,10 @@
     <w:rsid w:val="00680FFF"/>
     <w:rsid w:val="006B3248"/>
     <w:rsid w:val="006D04E6"/>
+    <w:rsid w:val="007052B4"/>
     <w:rsid w:val="0072129D"/>
     <w:rsid w:val="007A2CC3"/>
+    <w:rsid w:val="007E0098"/>
     <w:rsid w:val="007F595A"/>
     <w:rsid w:val="0081713B"/>
     <w:rsid w:val="008205E4"/>
@@ -10365,6 +8944,7 @@
     <w:rsid w:val="00B30E6D"/>
     <w:rsid w:val="00B545D6"/>
     <w:rsid w:val="00B67DAC"/>
+    <w:rsid w:val="00B870B4"/>
     <w:rsid w:val="00BC42C9"/>
     <w:rsid w:val="00C06761"/>
     <w:rsid w:val="00C4490D"/>
@@ -10382,6 +8962,7 @@
     <w:rsid w:val="00F37965"/>
     <w:rsid w:val="00FC4E33"/>
     <w:rsid w:val="00FC4FBB"/>
+    <w:rsid w:val="00FF34DC"/>
   </w:rsids>
   <m:mathPr>
     <m:mathFont m:val="Cambria Math"/>

</xml_diff>